<commit_message>
fix: Word zip strukturasini asl faylga muvofiqlashtirib xatolikni tuzatish
</commit_message>
<xml_diff>
--- a/backend/src/templates/TSH_template.docx
+++ b/backend/src/templates/TSH_template.docx
@@ -1,65 +1,5 @@
 
-<file path=customXml\item1.xml><?xml version="1.0" encoding="utf-8"?>
-<b:Sources xmlns:b="http://schemas.openxmlformats.org/officeDocument/2006/bibliography" xmlns="http://schemas.openxmlformats.org/officeDocument/2006/bibliography" SelectedStyle="\APA.XSL" StyleName="APA"/>
-</file>
-
-<file path=customXml\itemProps1.xml><?xml version="1.0" encoding="utf-8"?>
-<ds:datastoreItem xmlns:ds="http://schemas.openxmlformats.org/officeDocument/2006/customXml" ds:itemID="{4B5BE7AD-7AD7-4FE5-99D3-35BDF0133069}">
-  <ds:schemaRefs>
-    <ds:schemaRef ds:uri="http://schemas.openxmlformats.org/officeDocument/2006/bibliography"/>
-  </ds:schemaRefs>
-</ds:datastoreItem>
-</file>
-
-<file path=docProps\app.xml><?xml version="1.0" encoding="utf-8"?>
-<Properties xmlns="http://schemas.openxmlformats.org/officeDocument/2006/extended-properties" xmlns:vt="http://schemas.openxmlformats.org/officeDocument/2006/docPropsVTypes">
-  <Template>Normal</Template>
-  <TotalTime>288</TotalTime>
-  <Pages>4</Pages>
-  <Words>2016</Words>
-  <Characters>11496</Characters>
-  <Application>Microsoft Office Word</Application>
-  <DocSecurity>0</DocSecurity>
-  <Lines>95</Lines>
-  <Paragraphs>26</Paragraphs>
-  <ScaleCrop>false</ScaleCrop>
-  <HeadingPairs>
-    <vt:vector size="2" baseType="variant">
-      <vt:variant>
-        <vt:lpstr>Название</vt:lpstr>
-      </vt:variant>
-      <vt:variant>
-        <vt:i4>1</vt:i4>
-      </vt:variant>
-    </vt:vector>
-  </HeadingPairs>
-  <TitlesOfParts>
-    <vt:vector size="1" baseType="lpstr">
-      <vt:lpstr/>
-    </vt:vector>
-  </TitlesOfParts>
-  <Company>SPecialiST RePack</Company>
-  <LinksUpToDate>false</LinksUpToDate>
-  <CharactersWithSpaces>13486</CharactersWithSpaces>
-  <SharedDoc>false</SharedDoc>
-  <HyperlinksChanged>false</HyperlinksChanged>
-  <AppVersion>16.0000</AppVersion>
-</Properties>
-</file>
-
-<file path=docProps\core.xml><?xml version="1.0" encoding="utf-8"?>
-<cp:coreProperties xmlns:cp="http://schemas.openxmlformats.org/package/2006/metadata/core-properties" xmlns:dc="http://purl.org/dc/elements/1.1/" xmlns:dcterms="http://purl.org/dc/terms/" xmlns:dcmitype="http://purl.org/dc/dcmitype/" xmlns:xsi="http://www.w3.org/2001/XMLSchema-instance">
-  <dc:title/>
-  <dc:creator>Asus</dc:creator>
-  <cp:lastModifiedBy>HP</cp:lastModifiedBy>
-  <cp:revision>30</cp:revision>
-  <cp:lastPrinted>2026-06-30T13:06:00Z</cp:lastPrinted>
-  <dcterms:created xsi:type="dcterms:W3CDTF">2026-07-10T07:04:00Z</dcterms:created>
-  <dcterms:modified xsi:type="dcterms:W3CDTF">2026-07-30T10:24:00Z</dcterms:modified>
-</cp:coreProperties>
-</file>
-
-<file path=word\document.xml><?xml version="1.0" encoding="utf-8"?>
+<file path=word/document.xml><?xml version="1.0" encoding="utf-8"?>
 <w:document xmlns:wpc="http://schemas.microsoft.com/office/word/2010/wordprocessingCanvas" xmlns:cx="http://schemas.microsoft.com/office/drawing/2014/chartex" xmlns:cx1="http://schemas.microsoft.com/office/drawing/2015/9/8/chartex" xmlns:cx2="http://schemas.microsoft.com/office/drawing/2015/10/21/chartex" xmlns:cx3="http://schemas.microsoft.com/office/drawing/2016/5/9/chartex" xmlns:cx4="http://schemas.microsoft.com/office/drawing/2016/5/10/chartex" xmlns:cx5="http://schemas.microsoft.com/office/drawing/2016/5/11/chartex" xmlns:cx6="http://schemas.microsoft.com/office/drawing/2016/5/12/chartex" xmlns:cx7="http://schemas.microsoft.com/office/drawing/2016/5/13/chartex" xmlns:cx8="http://schemas.microsoft.com/office/drawing/2016/5/14/chartex" xmlns:mc="http://schemas.openxmlformats.org/markup-compatibility/2006" xmlns:aink="http://schemas.microsoft.com/office/drawing/2016/ink" xmlns:am3d="http://schemas.microsoft.com/office/drawing/2017/model3d" xmlns:o="urn:schemas-microsoft-com:office:office" xmlns:r="http://schemas.openxmlformats.org/officeDocument/2006/relationships" xmlns:m="http://schemas.openxmlformats.org/officeDocument/2006/math" xmlns:v="urn:schemas-microsoft-com:vml" xmlns:wp14="http://schemas.microsoft.com/office/word/2010/wordprocessingDrawing" xmlns:wp="http://schemas.openxmlformats.org/drawingml/2006/wordprocessingDrawing" xmlns:w10="urn:schemas-microsoft-com:office:word" xmlns:w="http://schemas.openxmlformats.org/wordprocessingml/2006/main" xmlns:w14="http://schemas.microsoft.com/office/word/2010/wordml" xmlns:w15="http://schemas.microsoft.com/office/word/2012/wordml" xmlns:w16cex="http://schemas.microsoft.com/office/word/2018/wordml/cex" xmlns:w16cid="http://schemas.microsoft.com/office/word/2016/wordml/cid" xmlns:w16="http://schemas.microsoft.com/office/word/2018/wordml" xmlns:w16se="http://schemas.microsoft.com/office/word/2015/wordml/symex" xmlns:wpg="http://schemas.microsoft.com/office/word/2010/wordprocessingGroup" xmlns:wpi="http://schemas.microsoft.com/office/word/2010/wordprocessingInk" xmlns:wne="http://schemas.microsoft.com/office/word/2006/wordml" xmlns:wps="http://schemas.microsoft.com/office/word/2010/wordprocessingShape" mc:Ignorable="w14 w15 w16se w16cid w16 w16cex wp14">
   <w:body>
     <w:p>
@@ -4346,7 +4286,7 @@
                       <w:szCs w:val="24"/>
                       <w:lang w:val="uz-Cyrl-UZ"/>
                     </w:rPr>
-                    <w:t>{location_url}</w:t>
+                    <w:t>https://maps.app.goo.gl/f9aazoZdvjS5DFge9</w:t>
                   </w:r>
                 </w:p>
               </w:tc>
@@ -18035,7 +17975,7 @@
 </w:document>
 </file>
 
-<file path=word\endnotes.xml><?xml version="1.0" encoding="utf-8"?>
+<file path=word/endnotes.xml><?xml version="1.0" encoding="utf-8"?>
 <w:endnotes xmlns:wpc="http://schemas.microsoft.com/office/word/2010/wordprocessingCanvas" xmlns:cx="http://schemas.microsoft.com/office/drawing/2014/chartex" xmlns:cx1="http://schemas.microsoft.com/office/drawing/2015/9/8/chartex" xmlns:cx2="http://schemas.microsoft.com/office/drawing/2015/10/21/chartex" xmlns:cx3="http://schemas.microsoft.com/office/drawing/2016/5/9/chartex" xmlns:cx4="http://schemas.microsoft.com/office/drawing/2016/5/10/chartex" xmlns:cx5="http://schemas.microsoft.com/office/drawing/2016/5/11/chartex" xmlns:cx6="http://schemas.microsoft.com/office/drawing/2016/5/12/chartex" xmlns:cx7="http://schemas.microsoft.com/office/drawing/2016/5/13/chartex" xmlns:cx8="http://schemas.microsoft.com/office/drawing/2016/5/14/chartex" xmlns:mc="http://schemas.openxmlformats.org/markup-compatibility/2006" xmlns:aink="http://schemas.microsoft.com/office/drawing/2016/ink" xmlns:am3d="http://schemas.microsoft.com/office/drawing/2017/model3d" xmlns:o="urn:schemas-microsoft-com:office:office" xmlns:r="http://schemas.openxmlformats.org/officeDocument/2006/relationships" xmlns:m="http://schemas.openxmlformats.org/officeDocument/2006/math" xmlns:v="urn:schemas-microsoft-com:vml" xmlns:wp14="http://schemas.microsoft.com/office/word/2010/wordprocessingDrawing" xmlns:wp="http://schemas.openxmlformats.org/drawingml/2006/wordprocessingDrawing" xmlns:w10="urn:schemas-microsoft-com:office:word" xmlns:w="http://schemas.openxmlformats.org/wordprocessingml/2006/main" xmlns:w14="http://schemas.microsoft.com/office/word/2010/wordml" xmlns:w15="http://schemas.microsoft.com/office/word/2012/wordml" xmlns:w16cex="http://schemas.microsoft.com/office/word/2018/wordml/cex" xmlns:w16cid="http://schemas.microsoft.com/office/word/2016/wordml/cid" xmlns:w16="http://schemas.microsoft.com/office/word/2018/wordml" xmlns:w16se="http://schemas.microsoft.com/office/word/2015/wordml/symex" xmlns:wpg="http://schemas.microsoft.com/office/word/2010/wordprocessingGroup" xmlns:wpi="http://schemas.microsoft.com/office/word/2010/wordprocessingInk" xmlns:wne="http://schemas.microsoft.com/office/word/2006/wordml" xmlns:wps="http://schemas.microsoft.com/office/word/2010/wordprocessingShape" mc:Ignorable="w14 w15 w16se w16cid w16 w16cex wp14">
   <w:endnote w:type="separator" w:id="-1">
     <w:p>
@@ -18060,47 +18000,7 @@
 </w:endnotes>
 </file>
 
-<file path=word\fontTable.xml><?xml version="1.0" encoding="utf-8"?>
-<w:fonts xmlns:mc="http://schemas.openxmlformats.org/markup-compatibility/2006" xmlns:r="http://schemas.openxmlformats.org/officeDocument/2006/relationships" xmlns:w="http://schemas.openxmlformats.org/wordprocessingml/2006/main" xmlns:w14="http://schemas.microsoft.com/office/word/2010/wordml" xmlns:w15="http://schemas.microsoft.com/office/word/2012/wordml" xmlns:w16cex="http://schemas.microsoft.com/office/word/2018/wordml/cex" xmlns:w16cid="http://schemas.microsoft.com/office/word/2016/wordml/cid" xmlns:w16="http://schemas.microsoft.com/office/word/2018/wordml" xmlns:w16se="http://schemas.microsoft.com/office/word/2015/wordml/symex" mc:Ignorable="w14 w15 w16se w16cid w16 w16cex">
-  <w:font w:name="Times New Roman">
-    <w:panose1 w:val="02020603050405020304"/>
-    <w:charset w:val="00"/>
-    <w:family w:val="roman"/>
-    <w:pitch w:val="variable"/>
-    <w:sig w:usb0="E0002EFF" w:usb1="C000785B" w:usb2="00000009" w:usb3="00000000" w:csb0="000001FF" w:csb1="00000000"/>
-  </w:font>
-  <w:font w:name="Calibri">
-    <w:panose1 w:val="020F0502020204030204"/>
-    <w:charset w:val="CC"/>
-    <w:family w:val="swiss"/>
-    <w:pitch w:val="variable"/>
-    <w:sig w:usb0="E4002EFF" w:usb1="C200247B" w:usb2="00000009" w:usb3="00000000" w:csb0="000001FF" w:csb1="00000000"/>
-  </w:font>
-  <w:font w:name="Tahoma">
-    <w:panose1 w:val="020B0604030504040204"/>
-    <w:charset w:val="CC"/>
-    <w:family w:val="swiss"/>
-    <w:pitch w:val="variable"/>
-    <w:sig w:usb0="E1002EFF" w:usb1="C000605B" w:usb2="00000029" w:usb3="00000000" w:csb0="000101FF" w:csb1="00000000"/>
-  </w:font>
-  <w:font w:name="Symbol">
-    <w:panose1 w:val="05050102010706020507"/>
-    <w:charset w:val="02"/>
-    <w:family w:val="roman"/>
-    <w:pitch w:val="variable"/>
-    <w:sig w:usb0="00000000" w:usb1="10000000" w:usb2="00000000" w:usb3="00000000" w:csb0="80000000" w:csb1="00000000"/>
-  </w:font>
-  <w:font w:name="Cambria">
-    <w:panose1 w:val="02040503050406030204"/>
-    <w:charset w:val="CC"/>
-    <w:family w:val="roman"/>
-    <w:pitch w:val="variable"/>
-    <w:sig w:usb0="E00006FF" w:usb1="420024FF" w:usb2="02000000" w:usb3="00000000" w:csb0="0000019F" w:csb1="00000000"/>
-  </w:font>
-</w:fonts>
-</file>
-
-<file path=word\footer1.xml><?xml version="1.0" encoding="utf-8"?>
+<file path=word/footer1.xml><?xml version="1.0" encoding="utf-8"?>
 <w:ftr xmlns:wpc="http://schemas.microsoft.com/office/word/2010/wordprocessingCanvas" xmlns:cx="http://schemas.microsoft.com/office/drawing/2014/chartex" xmlns:cx1="http://schemas.microsoft.com/office/drawing/2015/9/8/chartex" xmlns:cx2="http://schemas.microsoft.com/office/drawing/2015/10/21/chartex" xmlns:cx3="http://schemas.microsoft.com/office/drawing/2016/5/9/chartex" xmlns:cx4="http://schemas.microsoft.com/office/drawing/2016/5/10/chartex" xmlns:cx5="http://schemas.microsoft.com/office/drawing/2016/5/11/chartex" xmlns:cx6="http://schemas.microsoft.com/office/drawing/2016/5/12/chartex" xmlns:cx7="http://schemas.microsoft.com/office/drawing/2016/5/13/chartex" xmlns:cx8="http://schemas.microsoft.com/office/drawing/2016/5/14/chartex" xmlns:mc="http://schemas.openxmlformats.org/markup-compatibility/2006" xmlns:aink="http://schemas.microsoft.com/office/drawing/2016/ink" xmlns:am3d="http://schemas.microsoft.com/office/drawing/2017/model3d" xmlns:o="urn:schemas-microsoft-com:office:office" xmlns:r="http://schemas.openxmlformats.org/officeDocument/2006/relationships" xmlns:m="http://schemas.openxmlformats.org/officeDocument/2006/math" xmlns:v="urn:schemas-microsoft-com:vml" xmlns:wp14="http://schemas.microsoft.com/office/word/2010/wordprocessingDrawing" xmlns:wp="http://schemas.openxmlformats.org/drawingml/2006/wordprocessingDrawing" xmlns:w10="urn:schemas-microsoft-com:office:word" xmlns:w="http://schemas.openxmlformats.org/wordprocessingml/2006/main" xmlns:w14="http://schemas.microsoft.com/office/word/2010/wordml" xmlns:w15="http://schemas.microsoft.com/office/word/2012/wordml" xmlns:w16cex="http://schemas.microsoft.com/office/word/2018/wordml/cex" xmlns:w16cid="http://schemas.microsoft.com/office/word/2016/wordml/cid" xmlns:w16="http://schemas.microsoft.com/office/word/2018/wordml" xmlns:w16se="http://schemas.microsoft.com/office/word/2015/wordml/symex" xmlns:wpg="http://schemas.microsoft.com/office/word/2010/wordprocessingGroup" xmlns:wpi="http://schemas.microsoft.com/office/word/2010/wordprocessingInk" xmlns:wne="http://schemas.microsoft.com/office/word/2006/wordml" xmlns:wps="http://schemas.microsoft.com/office/word/2010/wordprocessingShape" mc:Ignorable="w14 w15 w16se w16cid w16 w16cex wp14">
   <w:sdt>
     <w:sdtPr>
@@ -18258,7 +18158,7 @@
 </w:ftr>
 </file>
 
-<file path=word\footer2.xml><?xml version="1.0" encoding="utf-8"?>
+<file path=word/footer2.xml><?xml version="1.0" encoding="utf-8"?>
 <w:ftr xmlns:wpc="http://schemas.microsoft.com/office/word/2010/wordprocessingCanvas" xmlns:cx="http://schemas.microsoft.com/office/drawing/2014/chartex" xmlns:cx1="http://schemas.microsoft.com/office/drawing/2015/9/8/chartex" xmlns:cx2="http://schemas.microsoft.com/office/drawing/2015/10/21/chartex" xmlns:cx3="http://schemas.microsoft.com/office/drawing/2016/5/9/chartex" xmlns:cx4="http://schemas.microsoft.com/office/drawing/2016/5/10/chartex" xmlns:cx5="http://schemas.microsoft.com/office/drawing/2016/5/11/chartex" xmlns:cx6="http://schemas.microsoft.com/office/drawing/2016/5/12/chartex" xmlns:cx7="http://schemas.microsoft.com/office/drawing/2016/5/13/chartex" xmlns:cx8="http://schemas.microsoft.com/office/drawing/2016/5/14/chartex" xmlns:mc="http://schemas.openxmlformats.org/markup-compatibility/2006" xmlns:aink="http://schemas.microsoft.com/office/drawing/2016/ink" xmlns:am3d="http://schemas.microsoft.com/office/drawing/2017/model3d" xmlns:o="urn:schemas-microsoft-com:office:office" xmlns:r="http://schemas.openxmlformats.org/officeDocument/2006/relationships" xmlns:m="http://schemas.openxmlformats.org/officeDocument/2006/math" xmlns:v="urn:schemas-microsoft-com:vml" xmlns:wp14="http://schemas.microsoft.com/office/word/2010/wordprocessingDrawing" xmlns:wp="http://schemas.openxmlformats.org/drawingml/2006/wordprocessingDrawing" xmlns:w10="urn:schemas-microsoft-com:office:word" xmlns:w="http://schemas.openxmlformats.org/wordprocessingml/2006/main" xmlns:w14="http://schemas.microsoft.com/office/word/2010/wordml" xmlns:w15="http://schemas.microsoft.com/office/word/2012/wordml" xmlns:w16cex="http://schemas.microsoft.com/office/word/2018/wordml/cex" xmlns:w16cid="http://schemas.microsoft.com/office/word/2016/wordml/cid" xmlns:w16="http://schemas.microsoft.com/office/word/2018/wordml" xmlns:w16se="http://schemas.microsoft.com/office/word/2015/wordml/symex" xmlns:wpg="http://schemas.microsoft.com/office/word/2010/wordprocessingGroup" xmlns:wpi="http://schemas.microsoft.com/office/word/2010/wordprocessingInk" xmlns:wne="http://schemas.microsoft.com/office/word/2006/wordml" xmlns:wps="http://schemas.microsoft.com/office/word/2010/wordprocessingShape" mc:Ignorable="w14 w15 w16se w16cid w16 w16cex wp14">
   <w:sdt>
     <w:sdtPr>
@@ -18426,7 +18326,7 @@
 </w:ftr>
 </file>
 
-<file path=word\footnotes.xml><?xml version="1.0" encoding="utf-8"?>
+<file path=word/footnotes.xml><?xml version="1.0" encoding="utf-8"?>
 <w:footnotes xmlns:wpc="http://schemas.microsoft.com/office/word/2010/wordprocessingCanvas" xmlns:cx="http://schemas.microsoft.com/office/drawing/2014/chartex" xmlns:cx1="http://schemas.microsoft.com/office/drawing/2015/9/8/chartex" xmlns:cx2="http://schemas.microsoft.com/office/drawing/2015/10/21/chartex" xmlns:cx3="http://schemas.microsoft.com/office/drawing/2016/5/9/chartex" xmlns:cx4="http://schemas.microsoft.com/office/drawing/2016/5/10/chartex" xmlns:cx5="http://schemas.microsoft.com/office/drawing/2016/5/11/chartex" xmlns:cx6="http://schemas.microsoft.com/office/drawing/2016/5/12/chartex" xmlns:cx7="http://schemas.microsoft.com/office/drawing/2016/5/13/chartex" xmlns:cx8="http://schemas.microsoft.com/office/drawing/2016/5/14/chartex" xmlns:mc="http://schemas.openxmlformats.org/markup-compatibility/2006" xmlns:aink="http://schemas.microsoft.com/office/drawing/2016/ink" xmlns:am3d="http://schemas.microsoft.com/office/drawing/2017/model3d" xmlns:o="urn:schemas-microsoft-com:office:office" xmlns:r="http://schemas.openxmlformats.org/officeDocument/2006/relationships" xmlns:m="http://schemas.openxmlformats.org/officeDocument/2006/math" xmlns:v="urn:schemas-microsoft-com:vml" xmlns:wp14="http://schemas.microsoft.com/office/word/2010/wordprocessingDrawing" xmlns:wp="http://schemas.openxmlformats.org/drawingml/2006/wordprocessingDrawing" xmlns:w10="urn:schemas-microsoft-com:office:word" xmlns:w="http://schemas.openxmlformats.org/wordprocessingml/2006/main" xmlns:w14="http://schemas.microsoft.com/office/word/2010/wordml" xmlns:w15="http://schemas.microsoft.com/office/word/2012/wordml" xmlns:w16cex="http://schemas.microsoft.com/office/word/2018/wordml/cex" xmlns:w16cid="http://schemas.microsoft.com/office/word/2016/wordml/cid" xmlns:w16="http://schemas.microsoft.com/office/word/2018/wordml" xmlns:w16se="http://schemas.microsoft.com/office/word/2015/wordml/symex" xmlns:wpg="http://schemas.microsoft.com/office/word/2010/wordprocessingGroup" xmlns:wpi="http://schemas.microsoft.com/office/word/2010/wordprocessingInk" xmlns:wne="http://schemas.microsoft.com/office/word/2006/wordml" xmlns:wps="http://schemas.microsoft.com/office/word/2010/wordprocessingShape" mc:Ignorable="w14 w15 w16se w16cid w16 w16cex wp14">
   <w:footnote w:type="separator" w:id="-1">
     <w:p>
@@ -18451,7 +18351,7 @@
 </w:footnotes>
 </file>
 
-<file path=word\numbering.xml><?xml version="1.0" encoding="utf-8"?>
+<file path=word/numbering.xml><?xml version="1.0" encoding="utf-8"?>
 <w:numbering xmlns:wpc="http://schemas.microsoft.com/office/word/2010/wordprocessingCanvas" xmlns:cx="http://schemas.microsoft.com/office/drawing/2014/chartex" xmlns:cx1="http://schemas.microsoft.com/office/drawing/2015/9/8/chartex" xmlns:cx2="http://schemas.microsoft.com/office/drawing/2015/10/21/chartex" xmlns:cx3="http://schemas.microsoft.com/office/drawing/2016/5/9/chartex" xmlns:cx4="http://schemas.microsoft.com/office/drawing/2016/5/10/chartex" xmlns:cx5="http://schemas.microsoft.com/office/drawing/2016/5/11/chartex" xmlns:cx6="http://schemas.microsoft.com/office/drawing/2016/5/12/chartex" xmlns:cx7="http://schemas.microsoft.com/office/drawing/2016/5/13/chartex" xmlns:cx8="http://schemas.microsoft.com/office/drawing/2016/5/14/chartex" xmlns:mc="http://schemas.openxmlformats.org/markup-compatibility/2006" xmlns:aink="http://schemas.microsoft.com/office/drawing/2016/ink" xmlns:am3d="http://schemas.microsoft.com/office/drawing/2017/model3d" xmlns:o="urn:schemas-microsoft-com:office:office" xmlns:r="http://schemas.openxmlformats.org/officeDocument/2006/relationships" xmlns:m="http://schemas.openxmlformats.org/officeDocument/2006/math" xmlns:v="urn:schemas-microsoft-com:vml" xmlns:wp14="http://schemas.microsoft.com/office/word/2010/wordprocessingDrawing" xmlns:wp="http://schemas.openxmlformats.org/drawingml/2006/wordprocessingDrawing" xmlns:w10="urn:schemas-microsoft-com:office:word" xmlns:w="http://schemas.openxmlformats.org/wordprocessingml/2006/main" xmlns:w14="http://schemas.microsoft.com/office/word/2010/wordml" xmlns:w15="http://schemas.microsoft.com/office/word/2012/wordml" xmlns:w16cex="http://schemas.microsoft.com/office/word/2018/wordml/cex" xmlns:w16cid="http://schemas.microsoft.com/office/word/2016/wordml/cid" xmlns:w16="http://schemas.microsoft.com/office/word/2018/wordml" xmlns:w16se="http://schemas.microsoft.com/office/word/2015/wordml/symex" xmlns:wpg="http://schemas.microsoft.com/office/word/2010/wordprocessingGroup" xmlns:wpi="http://schemas.microsoft.com/office/word/2010/wordprocessingInk" xmlns:wne="http://schemas.microsoft.com/office/word/2006/wordml" xmlns:wps="http://schemas.microsoft.com/office/word/2010/wordprocessingShape" mc:Ignorable="w14 w15 w16se w16cid w16 w16cex wp14">
   <w:abstractNum w:abstractNumId="0" w15:restartNumberingAfterBreak="0">
     <w:nsid w:val="002D630B"/>
@@ -18548,943 +18448,7 @@
 </w:numbering>
 </file>
 
-<file path=word\settings.xml><?xml version="1.0" encoding="utf-8"?>
-<w:settings xmlns:mc="http://schemas.openxmlformats.org/markup-compatibility/2006" xmlns:o="urn:schemas-microsoft-com:office:office" xmlns:r="http://schemas.openxmlformats.org/officeDocument/2006/relationships" xmlns:m="http://schemas.openxmlformats.org/officeDocument/2006/math" xmlns:v="urn:schemas-microsoft-com:vml" xmlns:w10="urn:schemas-microsoft-com:office:word" xmlns:w="http://schemas.openxmlformats.org/wordprocessingml/2006/main" xmlns:w14="http://schemas.microsoft.com/office/word/2010/wordml" xmlns:w15="http://schemas.microsoft.com/office/word/2012/wordml" xmlns:w16cex="http://schemas.microsoft.com/office/word/2018/wordml/cex" xmlns:w16cid="http://schemas.microsoft.com/office/word/2016/wordml/cid" xmlns:w16="http://schemas.microsoft.com/office/word/2018/wordml" xmlns:w16se="http://schemas.microsoft.com/office/word/2015/wordml/symex" xmlns:sl="http://schemas.openxmlformats.org/schemaLibrary/2006/main" mc:Ignorable="w14 w15 w16se w16cid w16 w16cex">
-  <w:zoom w:percent="100"/>
-  <w:proofState w:spelling="clean" w:grammar="clean"/>
-  <w:defaultTabStop w:val="708"/>
-  <w:characterSpacingControl w:val="doNotCompress"/>
-  <w:hdrShapeDefaults>
-    <o:shapedefaults v:ext="edit" spidmax="2049"/>
-  </w:hdrShapeDefaults>
-  <w:footnotePr>
-    <w:footnote w:id="-1"/>
-    <w:footnote w:id="0"/>
-  </w:footnotePr>
-  <w:endnotePr>
-    <w:endnote w:id="-1"/>
-    <w:endnote w:id="0"/>
-  </w:endnotePr>
-  <w:compat>
-    <w:compatSetting w:name="compatibilityMode" w:uri="http://schemas.microsoft.com/office/word" w:val="15"/>
-    <w:compatSetting w:name="overrideTableStyleFontSizeAndJustification" w:uri="http://schemas.microsoft.com/office/word" w:val="1"/>
-    <w:compatSetting w:name="enableOpenTypeFeatures" w:uri="http://schemas.microsoft.com/office/word" w:val="1"/>
-    <w:compatSetting w:name="doNotFlipMirrorIndents" w:uri="http://schemas.microsoft.com/office/word" w:val="1"/>
-    <w:compatSetting w:name="differentiateMultirowTableHeaders" w:uri="http://schemas.microsoft.com/office/word" w:val="1"/>
-    <w:compatSetting w:name="useWord2013TrackBottomHyphenation" w:uri="http://schemas.microsoft.com/office/word" w:val="1"/>
-  </w:compat>
-  <w:rsids>
-    <w:rsidRoot w:val="00867D71"/>
-    <w:rsid w:val="00001513"/>
-    <w:rsid w:val="0000204D"/>
-    <w:rsid w:val="0000489B"/>
-    <w:rsid w:val="00011084"/>
-    <w:rsid w:val="000118B4"/>
-    <w:rsid w:val="00012357"/>
-    <w:rsid w:val="0001325C"/>
-    <w:rsid w:val="00020863"/>
-    <w:rsid w:val="00020EE7"/>
-    <w:rsid w:val="0002189B"/>
-    <w:rsid w:val="00021EEA"/>
-    <w:rsid w:val="00023A80"/>
-    <w:rsid w:val="00030F0A"/>
-    <w:rsid w:val="00030F31"/>
-    <w:rsid w:val="000322FF"/>
-    <w:rsid w:val="00032FA7"/>
-    <w:rsid w:val="0003497F"/>
-    <w:rsid w:val="00036D1A"/>
-    <w:rsid w:val="00037BC8"/>
-    <w:rsid w:val="00042839"/>
-    <w:rsid w:val="000456DF"/>
-    <w:rsid w:val="00047FBE"/>
-    <w:rsid w:val="000535E2"/>
-    <w:rsid w:val="00054F20"/>
-    <w:rsid w:val="00067813"/>
-    <w:rsid w:val="00070981"/>
-    <w:rsid w:val="00072A84"/>
-    <w:rsid w:val="000738AF"/>
-    <w:rsid w:val="00073ABE"/>
-    <w:rsid w:val="00074661"/>
-    <w:rsid w:val="000748E4"/>
-    <w:rsid w:val="00081672"/>
-    <w:rsid w:val="00084914"/>
-    <w:rsid w:val="00084BC2"/>
-    <w:rsid w:val="00091947"/>
-    <w:rsid w:val="000927E8"/>
-    <w:rsid w:val="0009687C"/>
-    <w:rsid w:val="000A1A65"/>
-    <w:rsid w:val="000A1EC7"/>
-    <w:rsid w:val="000A2225"/>
-    <w:rsid w:val="000A237E"/>
-    <w:rsid w:val="000A5598"/>
-    <w:rsid w:val="000B0866"/>
-    <w:rsid w:val="000B1406"/>
-    <w:rsid w:val="000B2DEE"/>
-    <w:rsid w:val="000B368D"/>
-    <w:rsid w:val="000B6636"/>
-    <w:rsid w:val="000B6B74"/>
-    <w:rsid w:val="000C28FE"/>
-    <w:rsid w:val="000C357E"/>
-    <w:rsid w:val="000C693C"/>
-    <w:rsid w:val="000D151C"/>
-    <w:rsid w:val="000D1E50"/>
-    <w:rsid w:val="000D31F1"/>
-    <w:rsid w:val="000D517E"/>
-    <w:rsid w:val="000E1AF2"/>
-    <w:rsid w:val="000E207C"/>
-    <w:rsid w:val="000E27D9"/>
-    <w:rsid w:val="000E294A"/>
-    <w:rsid w:val="000E36D0"/>
-    <w:rsid w:val="000E7CD6"/>
-    <w:rsid w:val="000F2914"/>
-    <w:rsid w:val="000F3CAC"/>
-    <w:rsid w:val="0010040E"/>
-    <w:rsid w:val="00100C69"/>
-    <w:rsid w:val="00101F55"/>
-    <w:rsid w:val="0010438F"/>
-    <w:rsid w:val="00104456"/>
-    <w:rsid w:val="00107101"/>
-    <w:rsid w:val="00107C60"/>
-    <w:rsid w:val="00115165"/>
-    <w:rsid w:val="001156E4"/>
-    <w:rsid w:val="00115F62"/>
-    <w:rsid w:val="0011642E"/>
-    <w:rsid w:val="00120543"/>
-    <w:rsid w:val="00120785"/>
-    <w:rsid w:val="001271A8"/>
-    <w:rsid w:val="0013101F"/>
-    <w:rsid w:val="00135031"/>
-    <w:rsid w:val="00135735"/>
-    <w:rsid w:val="00136469"/>
-    <w:rsid w:val="00140671"/>
-    <w:rsid w:val="00143C95"/>
-    <w:rsid w:val="001446D7"/>
-    <w:rsid w:val="00160731"/>
-    <w:rsid w:val="00163F46"/>
-    <w:rsid w:val="00166271"/>
-    <w:rsid w:val="001724B6"/>
-    <w:rsid w:val="001735F6"/>
-    <w:rsid w:val="001811B3"/>
-    <w:rsid w:val="00181BA8"/>
-    <w:rsid w:val="00184175"/>
-    <w:rsid w:val="00184EEE"/>
-    <w:rsid w:val="001852C4"/>
-    <w:rsid w:val="001854A5"/>
-    <w:rsid w:val="001873ED"/>
-    <w:rsid w:val="001912C8"/>
-    <w:rsid w:val="001977B1"/>
-    <w:rsid w:val="001A252F"/>
-    <w:rsid w:val="001B2449"/>
-    <w:rsid w:val="001B3FEA"/>
-    <w:rsid w:val="001B6854"/>
-    <w:rsid w:val="001B7835"/>
-    <w:rsid w:val="001C3053"/>
-    <w:rsid w:val="001C430B"/>
-    <w:rsid w:val="001C6041"/>
-    <w:rsid w:val="001E3F3B"/>
-    <w:rsid w:val="001E5B4E"/>
-    <w:rsid w:val="001E634A"/>
-    <w:rsid w:val="001E6824"/>
-    <w:rsid w:val="001E68EA"/>
-    <w:rsid w:val="001E6A2D"/>
-    <w:rsid w:val="001E7C6C"/>
-    <w:rsid w:val="001F22AB"/>
-    <w:rsid w:val="00200A36"/>
-    <w:rsid w:val="002047F2"/>
-    <w:rsid w:val="002054CC"/>
-    <w:rsid w:val="00213D4E"/>
-    <w:rsid w:val="002170A8"/>
-    <w:rsid w:val="002201D2"/>
-    <w:rsid w:val="00221078"/>
-    <w:rsid w:val="0022278E"/>
-    <w:rsid w:val="00224265"/>
-    <w:rsid w:val="00224CA8"/>
-    <w:rsid w:val="002256A5"/>
-    <w:rsid w:val="00225D11"/>
-    <w:rsid w:val="002304B9"/>
-    <w:rsid w:val="00231072"/>
-    <w:rsid w:val="002346B3"/>
-    <w:rsid w:val="00234CD0"/>
-    <w:rsid w:val="0024064A"/>
-    <w:rsid w:val="00240F0E"/>
-    <w:rsid w:val="00241DF3"/>
-    <w:rsid w:val="0024414F"/>
-    <w:rsid w:val="002447EA"/>
-    <w:rsid w:val="0024613C"/>
-    <w:rsid w:val="002478AA"/>
-    <w:rsid w:val="00250CFD"/>
-    <w:rsid w:val="0025360B"/>
-    <w:rsid w:val="002539E8"/>
-    <w:rsid w:val="002562C5"/>
-    <w:rsid w:val="002567F9"/>
-    <w:rsid w:val="00261CA9"/>
-    <w:rsid w:val="0026510F"/>
-    <w:rsid w:val="00267BF0"/>
-    <w:rsid w:val="00271EB9"/>
-    <w:rsid w:val="00272459"/>
-    <w:rsid w:val="002802FF"/>
-    <w:rsid w:val="0028175E"/>
-    <w:rsid w:val="00281A0C"/>
-    <w:rsid w:val="00282430"/>
-    <w:rsid w:val="00283DB4"/>
-    <w:rsid w:val="002868E7"/>
-    <w:rsid w:val="00290B5A"/>
-    <w:rsid w:val="00290DF0"/>
-    <w:rsid w:val="00291489"/>
-    <w:rsid w:val="002942D0"/>
-    <w:rsid w:val="002957BF"/>
-    <w:rsid w:val="002977A1"/>
-    <w:rsid w:val="002A4DC2"/>
-    <w:rsid w:val="002A6350"/>
-    <w:rsid w:val="002B249E"/>
-    <w:rsid w:val="002B6290"/>
-    <w:rsid w:val="002B7FB9"/>
-    <w:rsid w:val="002C36F2"/>
-    <w:rsid w:val="002C5C91"/>
-    <w:rsid w:val="002D6EA5"/>
-    <w:rsid w:val="002E178A"/>
-    <w:rsid w:val="002E2F30"/>
-    <w:rsid w:val="002E6C7D"/>
-    <w:rsid w:val="002F1A28"/>
-    <w:rsid w:val="00311778"/>
-    <w:rsid w:val="0031235E"/>
-    <w:rsid w:val="00314D53"/>
-    <w:rsid w:val="00316B56"/>
-    <w:rsid w:val="00317681"/>
-    <w:rsid w:val="00331265"/>
-    <w:rsid w:val="00332DEC"/>
-    <w:rsid w:val="00333C29"/>
-    <w:rsid w:val="00334F28"/>
-    <w:rsid w:val="00337783"/>
-    <w:rsid w:val="00342179"/>
-    <w:rsid w:val="00345F1E"/>
-    <w:rsid w:val="00355793"/>
-    <w:rsid w:val="00361614"/>
-    <w:rsid w:val="00365656"/>
-    <w:rsid w:val="00365697"/>
-    <w:rsid w:val="0036645B"/>
-    <w:rsid w:val="003763A7"/>
-    <w:rsid w:val="0037673C"/>
-    <w:rsid w:val="00376C60"/>
-    <w:rsid w:val="00381069"/>
-    <w:rsid w:val="0038288A"/>
-    <w:rsid w:val="003845B9"/>
-    <w:rsid w:val="003845F2"/>
-    <w:rsid w:val="00384DC6"/>
-    <w:rsid w:val="0038696E"/>
-    <w:rsid w:val="00391AC0"/>
-    <w:rsid w:val="00391EDA"/>
-    <w:rsid w:val="003A1A6B"/>
-    <w:rsid w:val="003A3825"/>
-    <w:rsid w:val="003A4414"/>
-    <w:rsid w:val="003C03E8"/>
-    <w:rsid w:val="003C36FE"/>
-    <w:rsid w:val="003C7D37"/>
-    <w:rsid w:val="003D351E"/>
-    <w:rsid w:val="003D3B1C"/>
-    <w:rsid w:val="003D68F3"/>
-    <w:rsid w:val="003D6C9F"/>
-    <w:rsid w:val="003D7717"/>
-    <w:rsid w:val="003E017F"/>
-    <w:rsid w:val="003E2D1C"/>
-    <w:rsid w:val="003E61EB"/>
-    <w:rsid w:val="003E6685"/>
-    <w:rsid w:val="003E7DEC"/>
-    <w:rsid w:val="003F6AD0"/>
-    <w:rsid w:val="004036D1"/>
-    <w:rsid w:val="004075EC"/>
-    <w:rsid w:val="00407769"/>
-    <w:rsid w:val="00421DAB"/>
-    <w:rsid w:val="00424B09"/>
-    <w:rsid w:val="0042748A"/>
-    <w:rsid w:val="00430F69"/>
-    <w:rsid w:val="00434349"/>
-    <w:rsid w:val="00435177"/>
-    <w:rsid w:val="004406AE"/>
-    <w:rsid w:val="004410B9"/>
-    <w:rsid w:val="0044255A"/>
-    <w:rsid w:val="004448FB"/>
-    <w:rsid w:val="00445695"/>
-    <w:rsid w:val="0044694C"/>
-    <w:rsid w:val="00452A94"/>
-    <w:rsid w:val="00455A0E"/>
-    <w:rsid w:val="00457956"/>
-    <w:rsid w:val="00460408"/>
-    <w:rsid w:val="00461931"/>
-    <w:rsid w:val="0046672A"/>
-    <w:rsid w:val="00473B22"/>
-    <w:rsid w:val="00480AB6"/>
-    <w:rsid w:val="00480BBF"/>
-    <w:rsid w:val="004840A9"/>
-    <w:rsid w:val="00484C2C"/>
-    <w:rsid w:val="00486261"/>
-    <w:rsid w:val="00487A85"/>
-    <w:rsid w:val="00491203"/>
-    <w:rsid w:val="00493EB6"/>
-    <w:rsid w:val="00497159"/>
-    <w:rsid w:val="004A3A55"/>
-    <w:rsid w:val="004A4375"/>
-    <w:rsid w:val="004B423F"/>
-    <w:rsid w:val="004B4E94"/>
-    <w:rsid w:val="004B6CAE"/>
-    <w:rsid w:val="004B79BC"/>
-    <w:rsid w:val="004C056D"/>
-    <w:rsid w:val="004C48EA"/>
-    <w:rsid w:val="004C4D1A"/>
-    <w:rsid w:val="004D0E16"/>
-    <w:rsid w:val="004D2C96"/>
-    <w:rsid w:val="004E19E5"/>
-    <w:rsid w:val="004E2B4A"/>
-    <w:rsid w:val="004E339E"/>
-    <w:rsid w:val="004E4F61"/>
-    <w:rsid w:val="004E59A3"/>
-    <w:rsid w:val="004F2E41"/>
-    <w:rsid w:val="004F7217"/>
-    <w:rsid w:val="004F73B2"/>
-    <w:rsid w:val="00501F78"/>
-    <w:rsid w:val="00503DDA"/>
-    <w:rsid w:val="00507511"/>
-    <w:rsid w:val="00507861"/>
-    <w:rsid w:val="005108C1"/>
-    <w:rsid w:val="00510D04"/>
-    <w:rsid w:val="0051237B"/>
-    <w:rsid w:val="005138E9"/>
-    <w:rsid w:val="0051505D"/>
-    <w:rsid w:val="005166A5"/>
-    <w:rsid w:val="00516789"/>
-    <w:rsid w:val="0051683B"/>
-    <w:rsid w:val="0051685B"/>
-    <w:rsid w:val="00522149"/>
-    <w:rsid w:val="00525B5B"/>
-    <w:rsid w:val="00540352"/>
-    <w:rsid w:val="00540C3E"/>
-    <w:rsid w:val="00545C21"/>
-    <w:rsid w:val="00550635"/>
-    <w:rsid w:val="005524A3"/>
-    <w:rsid w:val="00553796"/>
-    <w:rsid w:val="0055428B"/>
-    <w:rsid w:val="00557AFC"/>
-    <w:rsid w:val="0056004F"/>
-    <w:rsid w:val="005600EB"/>
-    <w:rsid w:val="0056015C"/>
-    <w:rsid w:val="00563031"/>
-    <w:rsid w:val="00564C99"/>
-    <w:rsid w:val="00565379"/>
-    <w:rsid w:val="00566E12"/>
-    <w:rsid w:val="00567B1E"/>
-    <w:rsid w:val="0057070B"/>
-    <w:rsid w:val="00575708"/>
-    <w:rsid w:val="005809E3"/>
-    <w:rsid w:val="00581668"/>
-    <w:rsid w:val="005846FF"/>
-    <w:rsid w:val="005864E1"/>
-    <w:rsid w:val="00586E20"/>
-    <w:rsid w:val="005902F3"/>
-    <w:rsid w:val="00592CD3"/>
-    <w:rsid w:val="00594371"/>
-    <w:rsid w:val="005948B9"/>
-    <w:rsid w:val="005A0033"/>
-    <w:rsid w:val="005A3C1B"/>
-    <w:rsid w:val="005B4BC4"/>
-    <w:rsid w:val="005B62F9"/>
-    <w:rsid w:val="005B6F4F"/>
-    <w:rsid w:val="005C0711"/>
-    <w:rsid w:val="005C1C12"/>
-    <w:rsid w:val="005C437C"/>
-    <w:rsid w:val="005C572F"/>
-    <w:rsid w:val="005C6867"/>
-    <w:rsid w:val="005C7946"/>
-    <w:rsid w:val="005C7AB4"/>
-    <w:rsid w:val="005D0075"/>
-    <w:rsid w:val="005D1EF6"/>
-    <w:rsid w:val="005D3B86"/>
-    <w:rsid w:val="005D40F0"/>
-    <w:rsid w:val="005E356D"/>
-    <w:rsid w:val="005E53E4"/>
-    <w:rsid w:val="005E64AF"/>
-    <w:rsid w:val="005F292B"/>
-    <w:rsid w:val="005F61A2"/>
-    <w:rsid w:val="005F6290"/>
-    <w:rsid w:val="005F6351"/>
-    <w:rsid w:val="005F6D7B"/>
-    <w:rsid w:val="00610A3C"/>
-    <w:rsid w:val="00611888"/>
-    <w:rsid w:val="00612188"/>
-    <w:rsid w:val="0061717B"/>
-    <w:rsid w:val="00622116"/>
-    <w:rsid w:val="00622177"/>
-    <w:rsid w:val="00623B0E"/>
-    <w:rsid w:val="00624683"/>
-    <w:rsid w:val="00624FBC"/>
-    <w:rsid w:val="006256AF"/>
-    <w:rsid w:val="006321BD"/>
-    <w:rsid w:val="006366F0"/>
-    <w:rsid w:val="00650342"/>
-    <w:rsid w:val="0065216F"/>
-    <w:rsid w:val="006529D5"/>
-    <w:rsid w:val="006530D0"/>
-    <w:rsid w:val="0066154A"/>
-    <w:rsid w:val="006618F8"/>
-    <w:rsid w:val="006675E1"/>
-    <w:rsid w:val="006737C3"/>
-    <w:rsid w:val="00675316"/>
-    <w:rsid w:val="006802C5"/>
-    <w:rsid w:val="00681AA3"/>
-    <w:rsid w:val="00682B85"/>
-    <w:rsid w:val="00683A31"/>
-    <w:rsid w:val="0068791A"/>
-    <w:rsid w:val="0069050A"/>
-    <w:rsid w:val="00694B47"/>
-    <w:rsid w:val="006A28A2"/>
-    <w:rsid w:val="006A3B31"/>
-    <w:rsid w:val="006A3EDD"/>
-    <w:rsid w:val="006A521B"/>
-    <w:rsid w:val="006A5AF7"/>
-    <w:rsid w:val="006A61F6"/>
-    <w:rsid w:val="006B0CAA"/>
-    <w:rsid w:val="006B1439"/>
-    <w:rsid w:val="006B1946"/>
-    <w:rsid w:val="006B350A"/>
-    <w:rsid w:val="006B7C58"/>
-    <w:rsid w:val="006B7E05"/>
-    <w:rsid w:val="006B7F4C"/>
-    <w:rsid w:val="006C110D"/>
-    <w:rsid w:val="006C6E4E"/>
-    <w:rsid w:val="006D342E"/>
-    <w:rsid w:val="006D49AA"/>
-    <w:rsid w:val="006D6C0A"/>
-    <w:rsid w:val="006D7FCB"/>
-    <w:rsid w:val="006E0E40"/>
-    <w:rsid w:val="006E2119"/>
-    <w:rsid w:val="006E319C"/>
-    <w:rsid w:val="006E4C5E"/>
-    <w:rsid w:val="006E630D"/>
-    <w:rsid w:val="00700189"/>
-    <w:rsid w:val="00701039"/>
-    <w:rsid w:val="00701439"/>
-    <w:rsid w:val="007024BA"/>
-    <w:rsid w:val="007041F3"/>
-    <w:rsid w:val="0070441A"/>
-    <w:rsid w:val="007058C0"/>
-    <w:rsid w:val="00707C06"/>
-    <w:rsid w:val="007167E5"/>
-    <w:rsid w:val="00717348"/>
-    <w:rsid w:val="0072282F"/>
-    <w:rsid w:val="00722B12"/>
-    <w:rsid w:val="00722F7D"/>
-    <w:rsid w:val="007250AB"/>
-    <w:rsid w:val="00732B36"/>
-    <w:rsid w:val="00732DF3"/>
-    <w:rsid w:val="00741673"/>
-    <w:rsid w:val="007426C5"/>
-    <w:rsid w:val="00743EA3"/>
-    <w:rsid w:val="0075219F"/>
-    <w:rsid w:val="00756899"/>
-    <w:rsid w:val="007618CA"/>
-    <w:rsid w:val="007706AB"/>
-    <w:rsid w:val="00770706"/>
-    <w:rsid w:val="0077181B"/>
-    <w:rsid w:val="007749ED"/>
-    <w:rsid w:val="00777467"/>
-    <w:rsid w:val="007803DB"/>
-    <w:rsid w:val="00781F1B"/>
-    <w:rsid w:val="00786806"/>
-    <w:rsid w:val="00786DB3"/>
-    <w:rsid w:val="007912D6"/>
-    <w:rsid w:val="007944DB"/>
-    <w:rsid w:val="007A0487"/>
-    <w:rsid w:val="007A0E63"/>
-    <w:rsid w:val="007A1501"/>
-    <w:rsid w:val="007A1BBC"/>
-    <w:rsid w:val="007A2422"/>
-    <w:rsid w:val="007A374B"/>
-    <w:rsid w:val="007A46E4"/>
-    <w:rsid w:val="007A47A7"/>
-    <w:rsid w:val="007A4B78"/>
-    <w:rsid w:val="007A5499"/>
-    <w:rsid w:val="007A5E6C"/>
-    <w:rsid w:val="007B1BDF"/>
-    <w:rsid w:val="007B6C2E"/>
-    <w:rsid w:val="007B7620"/>
-    <w:rsid w:val="007C1944"/>
-    <w:rsid w:val="007C3BAD"/>
-    <w:rsid w:val="007D1EDE"/>
-    <w:rsid w:val="007D5BAC"/>
-    <w:rsid w:val="007E09F1"/>
-    <w:rsid w:val="007E24DC"/>
-    <w:rsid w:val="007E3994"/>
-    <w:rsid w:val="007E4D6F"/>
-    <w:rsid w:val="007E570D"/>
-    <w:rsid w:val="007E77DC"/>
-    <w:rsid w:val="007F0B9C"/>
-    <w:rsid w:val="007F11B4"/>
-    <w:rsid w:val="007F2377"/>
-    <w:rsid w:val="007F6131"/>
-    <w:rsid w:val="00800F10"/>
-    <w:rsid w:val="00801E80"/>
-    <w:rsid w:val="00825908"/>
-    <w:rsid w:val="0083181E"/>
-    <w:rsid w:val="00832DA5"/>
-    <w:rsid w:val="008331F9"/>
-    <w:rsid w:val="00835773"/>
-    <w:rsid w:val="00837E1B"/>
-    <w:rsid w:val="008518B8"/>
-    <w:rsid w:val="008545EC"/>
-    <w:rsid w:val="0085648E"/>
-    <w:rsid w:val="00861D4F"/>
-    <w:rsid w:val="00861EFB"/>
-    <w:rsid w:val="00863925"/>
-    <w:rsid w:val="00866793"/>
-    <w:rsid w:val="0086716E"/>
-    <w:rsid w:val="00867D71"/>
-    <w:rsid w:val="00872A50"/>
-    <w:rsid w:val="008735C8"/>
-    <w:rsid w:val="00874CE1"/>
-    <w:rsid w:val="008760C1"/>
-    <w:rsid w:val="008849CF"/>
-    <w:rsid w:val="00885CF1"/>
-    <w:rsid w:val="0088697F"/>
-    <w:rsid w:val="008917B9"/>
-    <w:rsid w:val="00892280"/>
-    <w:rsid w:val="00895354"/>
-    <w:rsid w:val="00896146"/>
-    <w:rsid w:val="00897AD5"/>
-    <w:rsid w:val="008A1062"/>
-    <w:rsid w:val="008A5701"/>
-    <w:rsid w:val="008A7152"/>
-    <w:rsid w:val="008B6304"/>
-    <w:rsid w:val="008C2004"/>
-    <w:rsid w:val="008C455F"/>
-    <w:rsid w:val="008C7531"/>
-    <w:rsid w:val="008D1712"/>
-    <w:rsid w:val="008D7979"/>
-    <w:rsid w:val="008E2494"/>
-    <w:rsid w:val="008E2F45"/>
-    <w:rsid w:val="008E53A5"/>
-    <w:rsid w:val="008F270F"/>
-    <w:rsid w:val="008F3FAE"/>
-    <w:rsid w:val="008F6F7C"/>
-    <w:rsid w:val="00901956"/>
-    <w:rsid w:val="00901BAA"/>
-    <w:rsid w:val="009064A1"/>
-    <w:rsid w:val="00911EA2"/>
-    <w:rsid w:val="00922141"/>
-    <w:rsid w:val="00924C0F"/>
-    <w:rsid w:val="009268EA"/>
-    <w:rsid w:val="00927EB1"/>
-    <w:rsid w:val="00932019"/>
-    <w:rsid w:val="00936B33"/>
-    <w:rsid w:val="00944DFD"/>
-    <w:rsid w:val="009519E8"/>
-    <w:rsid w:val="00953373"/>
-    <w:rsid w:val="00957F13"/>
-    <w:rsid w:val="00960C41"/>
-    <w:rsid w:val="009628E2"/>
-    <w:rsid w:val="0096477C"/>
-    <w:rsid w:val="009707FE"/>
-    <w:rsid w:val="009712F7"/>
-    <w:rsid w:val="009728AF"/>
-    <w:rsid w:val="00972FC0"/>
-    <w:rsid w:val="0097423E"/>
-    <w:rsid w:val="0097428D"/>
-    <w:rsid w:val="00975C06"/>
-    <w:rsid w:val="0097715A"/>
-    <w:rsid w:val="00980E88"/>
-    <w:rsid w:val="00982631"/>
-    <w:rsid w:val="00986ACB"/>
-    <w:rsid w:val="0098773A"/>
-    <w:rsid w:val="00991631"/>
-    <w:rsid w:val="00993EEB"/>
-    <w:rsid w:val="00994E72"/>
-    <w:rsid w:val="00995613"/>
-    <w:rsid w:val="00997777"/>
-    <w:rsid w:val="00997901"/>
-    <w:rsid w:val="009A060E"/>
-    <w:rsid w:val="009A2733"/>
-    <w:rsid w:val="009A406F"/>
-    <w:rsid w:val="009A6019"/>
-    <w:rsid w:val="009A78BB"/>
-    <w:rsid w:val="009B0EE6"/>
-    <w:rsid w:val="009B174A"/>
-    <w:rsid w:val="009B1BEA"/>
-    <w:rsid w:val="009B20F8"/>
-    <w:rsid w:val="009B3848"/>
-    <w:rsid w:val="009B4680"/>
-    <w:rsid w:val="009C052A"/>
-    <w:rsid w:val="009C1CFD"/>
-    <w:rsid w:val="009C4864"/>
-    <w:rsid w:val="009D024D"/>
-    <w:rsid w:val="009D2364"/>
-    <w:rsid w:val="009D2917"/>
-    <w:rsid w:val="009D2C2F"/>
-    <w:rsid w:val="009D5F89"/>
-    <w:rsid w:val="009D6E8F"/>
-    <w:rsid w:val="009E026F"/>
-    <w:rsid w:val="009E230D"/>
-    <w:rsid w:val="009E5ABD"/>
-    <w:rsid w:val="009F0861"/>
-    <w:rsid w:val="009F1C61"/>
-    <w:rsid w:val="009F2716"/>
-    <w:rsid w:val="009F286D"/>
-    <w:rsid w:val="009F4FB1"/>
-    <w:rsid w:val="009F6B82"/>
-    <w:rsid w:val="009F6E3A"/>
-    <w:rsid w:val="00A00914"/>
-    <w:rsid w:val="00A0111D"/>
-    <w:rsid w:val="00A0454C"/>
-    <w:rsid w:val="00A150AD"/>
-    <w:rsid w:val="00A201BF"/>
-    <w:rsid w:val="00A20D48"/>
-    <w:rsid w:val="00A35748"/>
-    <w:rsid w:val="00A36CE9"/>
-    <w:rsid w:val="00A36FA3"/>
-    <w:rsid w:val="00A40CC4"/>
-    <w:rsid w:val="00A43254"/>
-    <w:rsid w:val="00A46CCA"/>
-    <w:rsid w:val="00A51B76"/>
-    <w:rsid w:val="00A54489"/>
-    <w:rsid w:val="00A55B77"/>
-    <w:rsid w:val="00A623A4"/>
-    <w:rsid w:val="00A6267D"/>
-    <w:rsid w:val="00A653E8"/>
-    <w:rsid w:val="00A7020A"/>
-    <w:rsid w:val="00A721BC"/>
-    <w:rsid w:val="00A75958"/>
-    <w:rsid w:val="00A83E3C"/>
-    <w:rsid w:val="00A857F8"/>
-    <w:rsid w:val="00A863B3"/>
-    <w:rsid w:val="00A91B85"/>
-    <w:rsid w:val="00A95319"/>
-    <w:rsid w:val="00AA011E"/>
-    <w:rsid w:val="00AA5C0E"/>
-    <w:rsid w:val="00AA68FF"/>
-    <w:rsid w:val="00AB0027"/>
-    <w:rsid w:val="00AB1C99"/>
-    <w:rsid w:val="00AB2C33"/>
-    <w:rsid w:val="00AB3634"/>
-    <w:rsid w:val="00AB475D"/>
-    <w:rsid w:val="00AB6D3D"/>
-    <w:rsid w:val="00AC07E8"/>
-    <w:rsid w:val="00AC2177"/>
-    <w:rsid w:val="00AC4AF9"/>
-    <w:rsid w:val="00AD0857"/>
-    <w:rsid w:val="00AD33B7"/>
-    <w:rsid w:val="00AE16E5"/>
-    <w:rsid w:val="00AE5B10"/>
-    <w:rsid w:val="00AE6041"/>
-    <w:rsid w:val="00AE66C3"/>
-    <w:rsid w:val="00AE7722"/>
-    <w:rsid w:val="00AF1C5A"/>
-    <w:rsid w:val="00AF35C0"/>
-    <w:rsid w:val="00AF6BEA"/>
-    <w:rsid w:val="00AF7D32"/>
-    <w:rsid w:val="00B03FDF"/>
-    <w:rsid w:val="00B074B9"/>
-    <w:rsid w:val="00B0783E"/>
-    <w:rsid w:val="00B1046D"/>
-    <w:rsid w:val="00B15607"/>
-    <w:rsid w:val="00B17BB7"/>
-    <w:rsid w:val="00B2045E"/>
-    <w:rsid w:val="00B231AE"/>
-    <w:rsid w:val="00B26104"/>
-    <w:rsid w:val="00B315CD"/>
-    <w:rsid w:val="00B40E36"/>
-    <w:rsid w:val="00B44F84"/>
-    <w:rsid w:val="00B51D3F"/>
-    <w:rsid w:val="00B5553B"/>
-    <w:rsid w:val="00B55745"/>
-    <w:rsid w:val="00B55C35"/>
-    <w:rsid w:val="00B5749C"/>
-    <w:rsid w:val="00B64BB2"/>
-    <w:rsid w:val="00B67242"/>
-    <w:rsid w:val="00B75BB5"/>
-    <w:rsid w:val="00B803AF"/>
-    <w:rsid w:val="00B91DD5"/>
-    <w:rsid w:val="00B96F53"/>
-    <w:rsid w:val="00BA40CD"/>
-    <w:rsid w:val="00BA4C48"/>
-    <w:rsid w:val="00BA6342"/>
-    <w:rsid w:val="00BA7BF5"/>
-    <w:rsid w:val="00BB028D"/>
-    <w:rsid w:val="00BB041B"/>
-    <w:rsid w:val="00BB0A55"/>
-    <w:rsid w:val="00BB13D5"/>
-    <w:rsid w:val="00BB3733"/>
-    <w:rsid w:val="00BB460D"/>
-    <w:rsid w:val="00BB758C"/>
-    <w:rsid w:val="00BC1CA0"/>
-    <w:rsid w:val="00BC379B"/>
-    <w:rsid w:val="00BC3F76"/>
-    <w:rsid w:val="00BC5582"/>
-    <w:rsid w:val="00BC5C60"/>
-    <w:rsid w:val="00BC5FED"/>
-    <w:rsid w:val="00BC641C"/>
-    <w:rsid w:val="00BC7B68"/>
-    <w:rsid w:val="00BD168A"/>
-    <w:rsid w:val="00BD6766"/>
-    <w:rsid w:val="00BD769B"/>
-    <w:rsid w:val="00BE405D"/>
-    <w:rsid w:val="00BE5935"/>
-    <w:rsid w:val="00BE5CAA"/>
-    <w:rsid w:val="00BE7502"/>
-    <w:rsid w:val="00BF0493"/>
-    <w:rsid w:val="00BF0BE0"/>
-    <w:rsid w:val="00BF2091"/>
-    <w:rsid w:val="00BF7E15"/>
-    <w:rsid w:val="00C01282"/>
-    <w:rsid w:val="00C01F3B"/>
-    <w:rsid w:val="00C02BAD"/>
-    <w:rsid w:val="00C069C6"/>
-    <w:rsid w:val="00C06D7B"/>
-    <w:rsid w:val="00C124D3"/>
-    <w:rsid w:val="00C1276F"/>
-    <w:rsid w:val="00C13D55"/>
-    <w:rsid w:val="00C2471B"/>
-    <w:rsid w:val="00C269B7"/>
-    <w:rsid w:val="00C26B89"/>
-    <w:rsid w:val="00C34488"/>
-    <w:rsid w:val="00C37868"/>
-    <w:rsid w:val="00C46803"/>
-    <w:rsid w:val="00C50749"/>
-    <w:rsid w:val="00C50A6F"/>
-    <w:rsid w:val="00C5361F"/>
-    <w:rsid w:val="00C54B72"/>
-    <w:rsid w:val="00C56A5C"/>
-    <w:rsid w:val="00C57ECD"/>
-    <w:rsid w:val="00C619A4"/>
-    <w:rsid w:val="00C61CD0"/>
-    <w:rsid w:val="00C62E8C"/>
-    <w:rsid w:val="00C70120"/>
-    <w:rsid w:val="00C70693"/>
-    <w:rsid w:val="00C711F9"/>
-    <w:rsid w:val="00C728B4"/>
-    <w:rsid w:val="00C7352E"/>
-    <w:rsid w:val="00C73E20"/>
-    <w:rsid w:val="00C745BD"/>
-    <w:rsid w:val="00C77ED4"/>
-    <w:rsid w:val="00C81FD0"/>
-    <w:rsid w:val="00C8471C"/>
-    <w:rsid w:val="00C9012F"/>
-    <w:rsid w:val="00C94D38"/>
-    <w:rsid w:val="00C94D72"/>
-    <w:rsid w:val="00C95D84"/>
-    <w:rsid w:val="00CA3757"/>
-    <w:rsid w:val="00CA4E0C"/>
-    <w:rsid w:val="00CB28F9"/>
-    <w:rsid w:val="00CB5379"/>
-    <w:rsid w:val="00CB62C5"/>
-    <w:rsid w:val="00CB7ADF"/>
-    <w:rsid w:val="00CC0BBD"/>
-    <w:rsid w:val="00CC2797"/>
-    <w:rsid w:val="00CC36E0"/>
-    <w:rsid w:val="00CC3D8C"/>
-    <w:rsid w:val="00CD0F1A"/>
-    <w:rsid w:val="00CD3270"/>
-    <w:rsid w:val="00D0239F"/>
-    <w:rsid w:val="00D07A1F"/>
-    <w:rsid w:val="00D11F27"/>
-    <w:rsid w:val="00D1276A"/>
-    <w:rsid w:val="00D13734"/>
-    <w:rsid w:val="00D13845"/>
-    <w:rsid w:val="00D21491"/>
-    <w:rsid w:val="00D25A7E"/>
-    <w:rsid w:val="00D26B14"/>
-    <w:rsid w:val="00D2745E"/>
-    <w:rsid w:val="00D27CCC"/>
-    <w:rsid w:val="00D30BFB"/>
-    <w:rsid w:val="00D30C8F"/>
-    <w:rsid w:val="00D30D8E"/>
-    <w:rsid w:val="00D329CA"/>
-    <w:rsid w:val="00D3447E"/>
-    <w:rsid w:val="00D34E46"/>
-    <w:rsid w:val="00D3663F"/>
-    <w:rsid w:val="00D40824"/>
-    <w:rsid w:val="00D40A76"/>
-    <w:rsid w:val="00D517BB"/>
-    <w:rsid w:val="00D53DA9"/>
-    <w:rsid w:val="00D54874"/>
-    <w:rsid w:val="00D656B8"/>
-    <w:rsid w:val="00D700E9"/>
-    <w:rsid w:val="00D76B3B"/>
-    <w:rsid w:val="00D824C2"/>
-    <w:rsid w:val="00D83E05"/>
-    <w:rsid w:val="00D84BE1"/>
-    <w:rsid w:val="00D903CF"/>
-    <w:rsid w:val="00D9086D"/>
-    <w:rsid w:val="00D9401D"/>
-    <w:rsid w:val="00D940A5"/>
-    <w:rsid w:val="00DA0B2E"/>
-    <w:rsid w:val="00DA134F"/>
-    <w:rsid w:val="00DA46FD"/>
-    <w:rsid w:val="00DA6224"/>
-    <w:rsid w:val="00DB23EB"/>
-    <w:rsid w:val="00DB5D3A"/>
-    <w:rsid w:val="00DC0027"/>
-    <w:rsid w:val="00DC283B"/>
-    <w:rsid w:val="00DC29B8"/>
-    <w:rsid w:val="00DC3C88"/>
-    <w:rsid w:val="00DC4105"/>
-    <w:rsid w:val="00DC7099"/>
-    <w:rsid w:val="00DD31FE"/>
-    <w:rsid w:val="00DD52E2"/>
-    <w:rsid w:val="00DE0523"/>
-    <w:rsid w:val="00DE38F4"/>
-    <w:rsid w:val="00DE5EA4"/>
-    <w:rsid w:val="00DF3DC0"/>
-    <w:rsid w:val="00DF512D"/>
-    <w:rsid w:val="00DF6D34"/>
-    <w:rsid w:val="00E02870"/>
-    <w:rsid w:val="00E02B27"/>
-    <w:rsid w:val="00E03D55"/>
-    <w:rsid w:val="00E12D62"/>
-    <w:rsid w:val="00E165C0"/>
-    <w:rsid w:val="00E2294F"/>
-    <w:rsid w:val="00E26079"/>
-    <w:rsid w:val="00E33E32"/>
-    <w:rsid w:val="00E37930"/>
-    <w:rsid w:val="00E37A90"/>
-    <w:rsid w:val="00E37BD2"/>
-    <w:rsid w:val="00E432F9"/>
-    <w:rsid w:val="00E45027"/>
-    <w:rsid w:val="00E45700"/>
-    <w:rsid w:val="00E50972"/>
-    <w:rsid w:val="00E50D1A"/>
-    <w:rsid w:val="00E5378C"/>
-    <w:rsid w:val="00E53CF5"/>
-    <w:rsid w:val="00E543E6"/>
-    <w:rsid w:val="00E54731"/>
-    <w:rsid w:val="00E54C73"/>
-    <w:rsid w:val="00E6010E"/>
-    <w:rsid w:val="00E60367"/>
-    <w:rsid w:val="00E60C59"/>
-    <w:rsid w:val="00E61B13"/>
-    <w:rsid w:val="00E61CE5"/>
-    <w:rsid w:val="00E65ADE"/>
-    <w:rsid w:val="00E65CE0"/>
-    <w:rsid w:val="00E678B8"/>
-    <w:rsid w:val="00E67AFE"/>
-    <w:rsid w:val="00E71F57"/>
-    <w:rsid w:val="00E751E5"/>
-    <w:rsid w:val="00E75D09"/>
-    <w:rsid w:val="00E77CEC"/>
-    <w:rsid w:val="00E84564"/>
-    <w:rsid w:val="00E85152"/>
-    <w:rsid w:val="00E90EC6"/>
-    <w:rsid w:val="00E9332D"/>
-    <w:rsid w:val="00E946D4"/>
-    <w:rsid w:val="00EA0700"/>
-    <w:rsid w:val="00EA56B9"/>
-    <w:rsid w:val="00EB048A"/>
-    <w:rsid w:val="00EB142B"/>
-    <w:rsid w:val="00EB34EB"/>
-    <w:rsid w:val="00EB3FE6"/>
-    <w:rsid w:val="00EB69A1"/>
-    <w:rsid w:val="00EC0C92"/>
-    <w:rsid w:val="00EC19EE"/>
-    <w:rsid w:val="00EC23B8"/>
-    <w:rsid w:val="00EC54B4"/>
-    <w:rsid w:val="00EC5E57"/>
-    <w:rsid w:val="00ED30B8"/>
-    <w:rsid w:val="00ED3E6F"/>
-    <w:rsid w:val="00ED49EE"/>
-    <w:rsid w:val="00ED7379"/>
-    <w:rsid w:val="00ED77CD"/>
-    <w:rsid w:val="00EE496C"/>
-    <w:rsid w:val="00EE65E8"/>
-    <w:rsid w:val="00EE69EA"/>
-    <w:rsid w:val="00EE6AF5"/>
-    <w:rsid w:val="00EF392D"/>
-    <w:rsid w:val="00EF4DBD"/>
-    <w:rsid w:val="00EF5F05"/>
-    <w:rsid w:val="00F02074"/>
-    <w:rsid w:val="00F030A6"/>
-    <w:rsid w:val="00F10BF9"/>
-    <w:rsid w:val="00F13D83"/>
-    <w:rsid w:val="00F142FD"/>
-    <w:rsid w:val="00F16F22"/>
-    <w:rsid w:val="00F17B7F"/>
-    <w:rsid w:val="00F21792"/>
-    <w:rsid w:val="00F21D7A"/>
-    <w:rsid w:val="00F21F05"/>
-    <w:rsid w:val="00F22392"/>
-    <w:rsid w:val="00F23976"/>
-    <w:rsid w:val="00F23E2B"/>
-    <w:rsid w:val="00F3225E"/>
-    <w:rsid w:val="00F341B1"/>
-    <w:rsid w:val="00F35F1F"/>
-    <w:rsid w:val="00F44997"/>
-    <w:rsid w:val="00F53E3E"/>
-    <w:rsid w:val="00F5481B"/>
-    <w:rsid w:val="00F611B7"/>
-    <w:rsid w:val="00F624B4"/>
-    <w:rsid w:val="00F63B56"/>
-    <w:rsid w:val="00F6413D"/>
-    <w:rsid w:val="00F6454D"/>
-    <w:rsid w:val="00F646F2"/>
-    <w:rsid w:val="00F64A26"/>
-    <w:rsid w:val="00F659A0"/>
-    <w:rsid w:val="00F66DBB"/>
-    <w:rsid w:val="00F67619"/>
-    <w:rsid w:val="00F679F8"/>
-    <w:rsid w:val="00F717E3"/>
-    <w:rsid w:val="00F721E9"/>
-    <w:rsid w:val="00F74215"/>
-    <w:rsid w:val="00F75C44"/>
-    <w:rsid w:val="00F80CF2"/>
-    <w:rsid w:val="00F84756"/>
-    <w:rsid w:val="00F84A23"/>
-    <w:rsid w:val="00F85E13"/>
-    <w:rsid w:val="00F90740"/>
-    <w:rsid w:val="00F914EA"/>
-    <w:rsid w:val="00FA24F9"/>
-    <w:rsid w:val="00FA3741"/>
-    <w:rsid w:val="00FA3F0C"/>
-    <w:rsid w:val="00FA5C6B"/>
-    <w:rsid w:val="00FA60F4"/>
-    <w:rsid w:val="00FA6171"/>
-    <w:rsid w:val="00FB4EA0"/>
-    <w:rsid w:val="00FB5940"/>
-    <w:rsid w:val="00FB6AEA"/>
-    <w:rsid w:val="00FC6B29"/>
-    <w:rsid w:val="00FD1795"/>
-    <w:rsid w:val="00FE0FE1"/>
-    <w:rsid w:val="00FE5A13"/>
-    <w:rsid w:val="00FE5BE8"/>
-    <w:rsid w:val="00FF1208"/>
-    <w:rsid w:val="00FF37A8"/>
-    <w:rsid w:val="00FF68A7"/>
-    <w:rsid w:val="00FF735F"/>
-    <w:rsid w:val="00FF77B1"/>
-  </w:rsids>
-  <m:mathPr>
-    <m:mathFont m:val="Cambria Math"/>
-    <m:brkBin m:val="before"/>
-    <m:brkBinSub m:val="--"/>
-    <m:smallFrac m:val="0"/>
-    <m:dispDef/>
-    <m:lMargin m:val="0"/>
-    <m:rMargin m:val="0"/>
-    <m:defJc m:val="centerGroup"/>
-    <m:wrapIndent m:val="1440"/>
-    <m:intLim m:val="subSup"/>
-    <m:naryLim m:val="undOvr"/>
-  </m:mathPr>
-  <w:themeFontLang w:val="ru-RU"/>
-  <w:clrSchemeMapping w:bg1="light1" w:t1="dark1" w:bg2="light2" w:t2="dark2" w:accent1="accent1" w:accent2="accent2" w:accent3="accent3" w:accent4="accent4" w:accent5="accent5" w:accent6="accent6" w:hyperlink="hyperlink" w:followedHyperlink="followedHyperlink"/>
-  <w:shapeDefaults>
-    <o:shapedefaults v:ext="edit" spidmax="2049"/>
-    <o:shapelayout v:ext="edit">
-      <o:idmap v:ext="edit" data="1"/>
-    </o:shapelayout>
-  </w:shapeDefaults>
-  <w:decimalSymbol w:val=","/>
-  <w:listSeparator w:val=";"/>
-  <w14:docId w14:val="51448C3F"/>
-  <w15:docId w15:val="{9DA1C178-A166-4946-9956-F56C388B86EB}"/>
-</w:settings>
-</file>
-
-<file path=word\styles.xml><?xml version="1.0" encoding="utf-8"?>
+<file path=word/styles.xml><?xml version="1.0" encoding="utf-8"?>
 <w:styles xmlns:mc="http://schemas.openxmlformats.org/markup-compatibility/2006" xmlns:r="http://schemas.openxmlformats.org/officeDocument/2006/relationships" xmlns:w="http://schemas.openxmlformats.org/wordprocessingml/2006/main" xmlns:w14="http://schemas.microsoft.com/office/word/2010/wordml" xmlns:w15="http://schemas.microsoft.com/office/word/2012/wordml" xmlns:w16cex="http://schemas.microsoft.com/office/word/2018/wordml/cex" xmlns:w16cid="http://schemas.microsoft.com/office/word/2016/wordml/cid" xmlns:w16="http://schemas.microsoft.com/office/word/2018/wordml" xmlns:w16se="http://schemas.microsoft.com/office/word/2015/wordml/symex" mc:Ignorable="w14 w15 w16se w16cid w16 w16cex">
   <w:docDefaults>
     <w:rPrDefault>
@@ -20059,7 +19023,7 @@
 </w:styles>
 </file>
 
-<file path=word\theme\theme1.xml><?xml version="1.0" encoding="utf-8"?>
+<file path=word/theme/theme1.xml><?xml version="1.0" encoding="utf-8"?>
 <a:theme xmlns:a="http://schemas.openxmlformats.org/drawingml/2006/main" name="Тема Office">
   <a:themeElements>
     <a:clrScheme name="Стандартная">
@@ -20344,573 +19308,14 @@
 </a:theme>
 </file>
 
-<file path=word\webSettings.xml><?xml version="1.0" encoding="utf-8"?>
-<w:webSettings xmlns:mc="http://schemas.openxmlformats.org/markup-compatibility/2006" xmlns:r="http://schemas.openxmlformats.org/officeDocument/2006/relationships" xmlns:w="http://schemas.openxmlformats.org/wordprocessingml/2006/main" xmlns:w14="http://schemas.microsoft.com/office/word/2010/wordml" xmlns:w15="http://schemas.microsoft.com/office/word/2012/wordml" xmlns:w16cex="http://schemas.microsoft.com/office/word/2018/wordml/cex" xmlns:w16cid="http://schemas.microsoft.com/office/word/2016/wordml/cid" xmlns:w16="http://schemas.microsoft.com/office/word/2018/wordml" xmlns:w16se="http://schemas.microsoft.com/office/word/2015/wordml/symex" mc:Ignorable="w14 w15 w16se w16cid w16 w16cex">
-  <w:divs>
-    <w:div w:id="27804009">
-      <w:bodyDiv w:val="1"/>
-      <w:marLeft w:val="0"/>
-      <w:marRight w:val="0"/>
-      <w:marTop w:val="0"/>
-      <w:marBottom w:val="0"/>
-      <w:divBdr>
-        <w:top w:val="none" w:sz="0" w:space="0" w:color="auto"/>
-        <w:left w:val="none" w:sz="0" w:space="0" w:color="auto"/>
-        <w:bottom w:val="none" w:sz="0" w:space="0" w:color="auto"/>
-        <w:right w:val="none" w:sz="0" w:space="0" w:color="auto"/>
-      </w:divBdr>
-    </w:div>
-    <w:div w:id="135025365">
-      <w:bodyDiv w:val="1"/>
-      <w:marLeft w:val="0"/>
-      <w:marRight w:val="0"/>
-      <w:marTop w:val="0"/>
-      <w:marBottom w:val="0"/>
-      <w:divBdr>
-        <w:top w:val="none" w:sz="0" w:space="0" w:color="auto"/>
-        <w:left w:val="none" w:sz="0" w:space="0" w:color="auto"/>
-        <w:bottom w:val="none" w:sz="0" w:space="0" w:color="auto"/>
-        <w:right w:val="none" w:sz="0" w:space="0" w:color="auto"/>
-      </w:divBdr>
-    </w:div>
-    <w:div w:id="178394183">
-      <w:bodyDiv w:val="1"/>
-      <w:marLeft w:val="0"/>
-      <w:marRight w:val="0"/>
-      <w:marTop w:val="0"/>
-      <w:marBottom w:val="0"/>
-      <w:divBdr>
-        <w:top w:val="none" w:sz="0" w:space="0" w:color="auto"/>
-        <w:left w:val="none" w:sz="0" w:space="0" w:color="auto"/>
-        <w:bottom w:val="none" w:sz="0" w:space="0" w:color="auto"/>
-        <w:right w:val="none" w:sz="0" w:space="0" w:color="auto"/>
-      </w:divBdr>
-    </w:div>
-    <w:div w:id="270477502">
-      <w:bodyDiv w:val="1"/>
-      <w:marLeft w:val="0"/>
-      <w:marRight w:val="0"/>
-      <w:marTop w:val="0"/>
-      <w:marBottom w:val="0"/>
-      <w:divBdr>
-        <w:top w:val="none" w:sz="0" w:space="0" w:color="auto"/>
-        <w:left w:val="none" w:sz="0" w:space="0" w:color="auto"/>
-        <w:bottom w:val="none" w:sz="0" w:space="0" w:color="auto"/>
-        <w:right w:val="none" w:sz="0" w:space="0" w:color="auto"/>
-      </w:divBdr>
-    </w:div>
-    <w:div w:id="348337339">
-      <w:bodyDiv w:val="1"/>
-      <w:marLeft w:val="0"/>
-      <w:marRight w:val="0"/>
-      <w:marTop w:val="0"/>
-      <w:marBottom w:val="0"/>
-      <w:divBdr>
-        <w:top w:val="none" w:sz="0" w:space="0" w:color="auto"/>
-        <w:left w:val="none" w:sz="0" w:space="0" w:color="auto"/>
-        <w:bottom w:val="none" w:sz="0" w:space="0" w:color="auto"/>
-        <w:right w:val="none" w:sz="0" w:space="0" w:color="auto"/>
-      </w:divBdr>
-    </w:div>
-    <w:div w:id="361438206">
-      <w:bodyDiv w:val="1"/>
-      <w:marLeft w:val="0"/>
-      <w:marRight w:val="0"/>
-      <w:marTop w:val="0"/>
-      <w:marBottom w:val="0"/>
-      <w:divBdr>
-        <w:top w:val="none" w:sz="0" w:space="0" w:color="auto"/>
-        <w:left w:val="none" w:sz="0" w:space="0" w:color="auto"/>
-        <w:bottom w:val="none" w:sz="0" w:space="0" w:color="auto"/>
-        <w:right w:val="none" w:sz="0" w:space="0" w:color="auto"/>
-      </w:divBdr>
-    </w:div>
-    <w:div w:id="412625956">
-      <w:bodyDiv w:val="1"/>
-      <w:marLeft w:val="0"/>
-      <w:marRight w:val="0"/>
-      <w:marTop w:val="0"/>
-      <w:marBottom w:val="0"/>
-      <w:divBdr>
-        <w:top w:val="none" w:sz="0" w:space="0" w:color="auto"/>
-        <w:left w:val="none" w:sz="0" w:space="0" w:color="auto"/>
-        <w:bottom w:val="none" w:sz="0" w:space="0" w:color="auto"/>
-        <w:right w:val="none" w:sz="0" w:space="0" w:color="auto"/>
-      </w:divBdr>
-    </w:div>
-    <w:div w:id="451284696">
-      <w:bodyDiv w:val="1"/>
-      <w:marLeft w:val="0"/>
-      <w:marRight w:val="0"/>
-      <w:marTop w:val="0"/>
-      <w:marBottom w:val="0"/>
-      <w:divBdr>
-        <w:top w:val="none" w:sz="0" w:space="0" w:color="auto"/>
-        <w:left w:val="none" w:sz="0" w:space="0" w:color="auto"/>
-        <w:bottom w:val="none" w:sz="0" w:space="0" w:color="auto"/>
-        <w:right w:val="none" w:sz="0" w:space="0" w:color="auto"/>
-      </w:divBdr>
-    </w:div>
-    <w:div w:id="521818513">
-      <w:bodyDiv w:val="1"/>
-      <w:marLeft w:val="0"/>
-      <w:marRight w:val="0"/>
-      <w:marTop w:val="0"/>
-      <w:marBottom w:val="0"/>
-      <w:divBdr>
-        <w:top w:val="none" w:sz="0" w:space="0" w:color="auto"/>
-        <w:left w:val="none" w:sz="0" w:space="0" w:color="auto"/>
-        <w:bottom w:val="none" w:sz="0" w:space="0" w:color="auto"/>
-        <w:right w:val="none" w:sz="0" w:space="0" w:color="auto"/>
-      </w:divBdr>
-    </w:div>
-    <w:div w:id="531529486">
-      <w:bodyDiv w:val="1"/>
-      <w:marLeft w:val="0"/>
-      <w:marRight w:val="0"/>
-      <w:marTop w:val="0"/>
-      <w:marBottom w:val="0"/>
-      <w:divBdr>
-        <w:top w:val="none" w:sz="0" w:space="0" w:color="auto"/>
-        <w:left w:val="none" w:sz="0" w:space="0" w:color="auto"/>
-        <w:bottom w:val="none" w:sz="0" w:space="0" w:color="auto"/>
-        <w:right w:val="none" w:sz="0" w:space="0" w:color="auto"/>
-      </w:divBdr>
-    </w:div>
-    <w:div w:id="586307688">
-      <w:bodyDiv w:val="1"/>
-      <w:marLeft w:val="0"/>
-      <w:marRight w:val="0"/>
-      <w:marTop w:val="0"/>
-      <w:marBottom w:val="0"/>
-      <w:divBdr>
-        <w:top w:val="none" w:sz="0" w:space="0" w:color="auto"/>
-        <w:left w:val="none" w:sz="0" w:space="0" w:color="auto"/>
-        <w:bottom w:val="none" w:sz="0" w:space="0" w:color="auto"/>
-        <w:right w:val="none" w:sz="0" w:space="0" w:color="auto"/>
-      </w:divBdr>
-    </w:div>
-    <w:div w:id="590159983">
-      <w:bodyDiv w:val="1"/>
-      <w:marLeft w:val="0"/>
-      <w:marRight w:val="0"/>
-      <w:marTop w:val="0"/>
-      <w:marBottom w:val="0"/>
-      <w:divBdr>
-        <w:top w:val="none" w:sz="0" w:space="0" w:color="auto"/>
-        <w:left w:val="none" w:sz="0" w:space="0" w:color="auto"/>
-        <w:bottom w:val="none" w:sz="0" w:space="0" w:color="auto"/>
-        <w:right w:val="none" w:sz="0" w:space="0" w:color="auto"/>
-      </w:divBdr>
-    </w:div>
-    <w:div w:id="678433453">
-      <w:bodyDiv w:val="1"/>
-      <w:marLeft w:val="0"/>
-      <w:marRight w:val="0"/>
-      <w:marTop w:val="0"/>
-      <w:marBottom w:val="0"/>
-      <w:divBdr>
-        <w:top w:val="none" w:sz="0" w:space="0" w:color="auto"/>
-        <w:left w:val="none" w:sz="0" w:space="0" w:color="auto"/>
-        <w:bottom w:val="none" w:sz="0" w:space="0" w:color="auto"/>
-        <w:right w:val="none" w:sz="0" w:space="0" w:color="auto"/>
-      </w:divBdr>
-    </w:div>
-    <w:div w:id="745810346">
-      <w:bodyDiv w:val="1"/>
-      <w:marLeft w:val="0"/>
-      <w:marRight w:val="0"/>
-      <w:marTop w:val="0"/>
-      <w:marBottom w:val="0"/>
-      <w:divBdr>
-        <w:top w:val="none" w:sz="0" w:space="0" w:color="auto"/>
-        <w:left w:val="none" w:sz="0" w:space="0" w:color="auto"/>
-        <w:bottom w:val="none" w:sz="0" w:space="0" w:color="auto"/>
-        <w:right w:val="none" w:sz="0" w:space="0" w:color="auto"/>
-      </w:divBdr>
-    </w:div>
-    <w:div w:id="752747849">
-      <w:bodyDiv w:val="1"/>
-      <w:marLeft w:val="0"/>
-      <w:marRight w:val="0"/>
-      <w:marTop w:val="0"/>
-      <w:marBottom w:val="0"/>
-      <w:divBdr>
-        <w:top w:val="none" w:sz="0" w:space="0" w:color="auto"/>
-        <w:left w:val="none" w:sz="0" w:space="0" w:color="auto"/>
-        <w:bottom w:val="none" w:sz="0" w:space="0" w:color="auto"/>
-        <w:right w:val="none" w:sz="0" w:space="0" w:color="auto"/>
-      </w:divBdr>
-    </w:div>
-    <w:div w:id="802699941">
-      <w:bodyDiv w:val="1"/>
-      <w:marLeft w:val="0"/>
-      <w:marRight w:val="0"/>
-      <w:marTop w:val="0"/>
-      <w:marBottom w:val="0"/>
-      <w:divBdr>
-        <w:top w:val="none" w:sz="0" w:space="0" w:color="auto"/>
-        <w:left w:val="none" w:sz="0" w:space="0" w:color="auto"/>
-        <w:bottom w:val="none" w:sz="0" w:space="0" w:color="auto"/>
-        <w:right w:val="none" w:sz="0" w:space="0" w:color="auto"/>
-      </w:divBdr>
-    </w:div>
-    <w:div w:id="1109659187">
-      <w:bodyDiv w:val="1"/>
-      <w:marLeft w:val="0"/>
-      <w:marRight w:val="0"/>
-      <w:marTop w:val="0"/>
-      <w:marBottom w:val="0"/>
-      <w:divBdr>
-        <w:top w:val="none" w:sz="0" w:space="0" w:color="auto"/>
-        <w:left w:val="none" w:sz="0" w:space="0" w:color="auto"/>
-        <w:bottom w:val="none" w:sz="0" w:space="0" w:color="auto"/>
-        <w:right w:val="none" w:sz="0" w:space="0" w:color="auto"/>
-      </w:divBdr>
-    </w:div>
-    <w:div w:id="1135685873">
-      <w:bodyDiv w:val="1"/>
-      <w:marLeft w:val="0"/>
-      <w:marRight w:val="0"/>
-      <w:marTop w:val="0"/>
-      <w:marBottom w:val="0"/>
-      <w:divBdr>
-        <w:top w:val="none" w:sz="0" w:space="0" w:color="auto"/>
-        <w:left w:val="none" w:sz="0" w:space="0" w:color="auto"/>
-        <w:bottom w:val="none" w:sz="0" w:space="0" w:color="auto"/>
-        <w:right w:val="none" w:sz="0" w:space="0" w:color="auto"/>
-      </w:divBdr>
-    </w:div>
-    <w:div w:id="1212768619">
-      <w:bodyDiv w:val="1"/>
-      <w:marLeft w:val="0"/>
-      <w:marRight w:val="0"/>
-      <w:marTop w:val="0"/>
-      <w:marBottom w:val="0"/>
-      <w:divBdr>
-        <w:top w:val="none" w:sz="0" w:space="0" w:color="auto"/>
-        <w:left w:val="none" w:sz="0" w:space="0" w:color="auto"/>
-        <w:bottom w:val="none" w:sz="0" w:space="0" w:color="auto"/>
-        <w:right w:val="none" w:sz="0" w:space="0" w:color="auto"/>
-      </w:divBdr>
-    </w:div>
-    <w:div w:id="1223830907">
-      <w:bodyDiv w:val="1"/>
-      <w:marLeft w:val="0"/>
-      <w:marRight w:val="0"/>
-      <w:marTop w:val="0"/>
-      <w:marBottom w:val="0"/>
-      <w:divBdr>
-        <w:top w:val="none" w:sz="0" w:space="0" w:color="auto"/>
-        <w:left w:val="none" w:sz="0" w:space="0" w:color="auto"/>
-        <w:bottom w:val="none" w:sz="0" w:space="0" w:color="auto"/>
-        <w:right w:val="none" w:sz="0" w:space="0" w:color="auto"/>
-      </w:divBdr>
-    </w:div>
-    <w:div w:id="1257054818">
-      <w:bodyDiv w:val="1"/>
-      <w:marLeft w:val="0"/>
-      <w:marRight w:val="0"/>
-      <w:marTop w:val="0"/>
-      <w:marBottom w:val="0"/>
-      <w:divBdr>
-        <w:top w:val="none" w:sz="0" w:space="0" w:color="auto"/>
-        <w:left w:val="none" w:sz="0" w:space="0" w:color="auto"/>
-        <w:bottom w:val="none" w:sz="0" w:space="0" w:color="auto"/>
-        <w:right w:val="none" w:sz="0" w:space="0" w:color="auto"/>
-      </w:divBdr>
-    </w:div>
-    <w:div w:id="1265308544">
-      <w:bodyDiv w:val="1"/>
-      <w:marLeft w:val="0"/>
-      <w:marRight w:val="0"/>
-      <w:marTop w:val="0"/>
-      <w:marBottom w:val="0"/>
-      <w:divBdr>
-        <w:top w:val="none" w:sz="0" w:space="0" w:color="auto"/>
-        <w:left w:val="none" w:sz="0" w:space="0" w:color="auto"/>
-        <w:bottom w:val="none" w:sz="0" w:space="0" w:color="auto"/>
-        <w:right w:val="none" w:sz="0" w:space="0" w:color="auto"/>
-      </w:divBdr>
-    </w:div>
-    <w:div w:id="1359895970">
-      <w:bodyDiv w:val="1"/>
-      <w:marLeft w:val="0"/>
-      <w:marRight w:val="0"/>
-      <w:marTop w:val="0"/>
-      <w:marBottom w:val="0"/>
-      <w:divBdr>
-        <w:top w:val="none" w:sz="0" w:space="0" w:color="auto"/>
-        <w:left w:val="none" w:sz="0" w:space="0" w:color="auto"/>
-        <w:bottom w:val="none" w:sz="0" w:space="0" w:color="auto"/>
-        <w:right w:val="none" w:sz="0" w:space="0" w:color="auto"/>
-      </w:divBdr>
-    </w:div>
-    <w:div w:id="1416051136">
-      <w:bodyDiv w:val="1"/>
-      <w:marLeft w:val="0"/>
-      <w:marRight w:val="0"/>
-      <w:marTop w:val="0"/>
-      <w:marBottom w:val="0"/>
-      <w:divBdr>
-        <w:top w:val="none" w:sz="0" w:space="0" w:color="auto"/>
-        <w:left w:val="none" w:sz="0" w:space="0" w:color="auto"/>
-        <w:bottom w:val="none" w:sz="0" w:space="0" w:color="auto"/>
-        <w:right w:val="none" w:sz="0" w:space="0" w:color="auto"/>
-      </w:divBdr>
-    </w:div>
-    <w:div w:id="1544637683">
-      <w:bodyDiv w:val="1"/>
-      <w:marLeft w:val="0"/>
-      <w:marRight w:val="0"/>
-      <w:marTop w:val="0"/>
-      <w:marBottom w:val="0"/>
-      <w:divBdr>
-        <w:top w:val="none" w:sz="0" w:space="0" w:color="auto"/>
-        <w:left w:val="none" w:sz="0" w:space="0" w:color="auto"/>
-        <w:bottom w:val="none" w:sz="0" w:space="0" w:color="auto"/>
-        <w:right w:val="none" w:sz="0" w:space="0" w:color="auto"/>
-      </w:divBdr>
-    </w:div>
-    <w:div w:id="1563364431">
-      <w:bodyDiv w:val="1"/>
-      <w:marLeft w:val="0"/>
-      <w:marRight w:val="0"/>
-      <w:marTop w:val="0"/>
-      <w:marBottom w:val="0"/>
-      <w:divBdr>
-        <w:top w:val="none" w:sz="0" w:space="0" w:color="auto"/>
-        <w:left w:val="none" w:sz="0" w:space="0" w:color="auto"/>
-        <w:bottom w:val="none" w:sz="0" w:space="0" w:color="auto"/>
-        <w:right w:val="none" w:sz="0" w:space="0" w:color="auto"/>
-      </w:divBdr>
-    </w:div>
-    <w:div w:id="1587111520">
-      <w:bodyDiv w:val="1"/>
-      <w:marLeft w:val="0"/>
-      <w:marRight w:val="0"/>
-      <w:marTop w:val="0"/>
-      <w:marBottom w:val="0"/>
-      <w:divBdr>
-        <w:top w:val="none" w:sz="0" w:space="0" w:color="auto"/>
-        <w:left w:val="none" w:sz="0" w:space="0" w:color="auto"/>
-        <w:bottom w:val="none" w:sz="0" w:space="0" w:color="auto"/>
-        <w:right w:val="none" w:sz="0" w:space="0" w:color="auto"/>
-      </w:divBdr>
-      <w:divsChild>
-        <w:div w:id="194007016">
-          <w:marLeft w:val="0"/>
-          <w:marRight w:val="0"/>
-          <w:marTop w:val="0"/>
-          <w:marBottom w:val="150"/>
-          <w:divBdr>
-            <w:top w:val="none" w:sz="0" w:space="0" w:color="auto"/>
-            <w:left w:val="none" w:sz="0" w:space="0" w:color="auto"/>
-            <w:bottom w:val="none" w:sz="0" w:space="0" w:color="auto"/>
-            <w:right w:val="none" w:sz="0" w:space="0" w:color="auto"/>
-          </w:divBdr>
-          <w:divsChild>
-            <w:div w:id="658460688">
-              <w:marLeft w:val="0"/>
-              <w:marRight w:val="0"/>
-              <w:marTop w:val="0"/>
-              <w:marBottom w:val="0"/>
-              <w:divBdr>
-                <w:top w:val="none" w:sz="0" w:space="0" w:color="auto"/>
-                <w:left w:val="none" w:sz="0" w:space="0" w:color="auto"/>
-                <w:bottom w:val="none" w:sz="0" w:space="0" w:color="auto"/>
-                <w:right w:val="none" w:sz="0" w:space="0" w:color="auto"/>
-              </w:divBdr>
-            </w:div>
-          </w:divsChild>
-        </w:div>
-        <w:div w:id="53240324">
-          <w:marLeft w:val="0"/>
-          <w:marRight w:val="0"/>
-          <w:marTop w:val="0"/>
-          <w:marBottom w:val="150"/>
-          <w:divBdr>
-            <w:top w:val="none" w:sz="0" w:space="0" w:color="auto"/>
-            <w:left w:val="none" w:sz="0" w:space="0" w:color="auto"/>
-            <w:bottom w:val="none" w:sz="0" w:space="0" w:color="auto"/>
-            <w:right w:val="none" w:sz="0" w:space="0" w:color="auto"/>
-          </w:divBdr>
-          <w:divsChild>
-            <w:div w:id="326445526">
-              <w:marLeft w:val="0"/>
-              <w:marRight w:val="0"/>
-              <w:marTop w:val="0"/>
-              <w:marBottom w:val="0"/>
-              <w:divBdr>
-                <w:top w:val="none" w:sz="0" w:space="0" w:color="auto"/>
-                <w:left w:val="none" w:sz="0" w:space="0" w:color="auto"/>
-                <w:bottom w:val="none" w:sz="0" w:space="0" w:color="auto"/>
-                <w:right w:val="none" w:sz="0" w:space="0" w:color="auto"/>
-              </w:divBdr>
-            </w:div>
-          </w:divsChild>
-        </w:div>
-        <w:div w:id="1223445578">
-          <w:marLeft w:val="0"/>
-          <w:marRight w:val="0"/>
-          <w:marTop w:val="0"/>
-          <w:marBottom w:val="150"/>
-          <w:divBdr>
-            <w:top w:val="none" w:sz="0" w:space="0" w:color="auto"/>
-            <w:left w:val="none" w:sz="0" w:space="0" w:color="auto"/>
-            <w:bottom w:val="none" w:sz="0" w:space="0" w:color="auto"/>
-            <w:right w:val="none" w:sz="0" w:space="0" w:color="auto"/>
-          </w:divBdr>
-          <w:divsChild>
-            <w:div w:id="1435710650">
-              <w:marLeft w:val="0"/>
-              <w:marRight w:val="0"/>
-              <w:marTop w:val="0"/>
-              <w:marBottom w:val="0"/>
-              <w:divBdr>
-                <w:top w:val="none" w:sz="0" w:space="0" w:color="auto"/>
-                <w:left w:val="none" w:sz="0" w:space="0" w:color="auto"/>
-                <w:bottom w:val="none" w:sz="0" w:space="0" w:color="auto"/>
-                <w:right w:val="none" w:sz="0" w:space="0" w:color="auto"/>
-              </w:divBdr>
-            </w:div>
-          </w:divsChild>
-        </w:div>
-      </w:divsChild>
-    </w:div>
-    <w:div w:id="1876891540">
-      <w:bodyDiv w:val="1"/>
-      <w:marLeft w:val="0"/>
-      <w:marRight w:val="0"/>
-      <w:marTop w:val="0"/>
-      <w:marBottom w:val="0"/>
-      <w:divBdr>
-        <w:top w:val="none" w:sz="0" w:space="0" w:color="auto"/>
-        <w:left w:val="none" w:sz="0" w:space="0" w:color="auto"/>
-        <w:bottom w:val="none" w:sz="0" w:space="0" w:color="auto"/>
-        <w:right w:val="none" w:sz="0" w:space="0" w:color="auto"/>
-      </w:divBdr>
-    </w:div>
-    <w:div w:id="1936404983">
-      <w:bodyDiv w:val="1"/>
-      <w:marLeft w:val="0"/>
-      <w:marRight w:val="0"/>
-      <w:marTop w:val="0"/>
-      <w:marBottom w:val="0"/>
-      <w:divBdr>
-        <w:top w:val="none" w:sz="0" w:space="0" w:color="auto"/>
-        <w:left w:val="none" w:sz="0" w:space="0" w:color="auto"/>
-        <w:bottom w:val="none" w:sz="0" w:space="0" w:color="auto"/>
-        <w:right w:val="none" w:sz="0" w:space="0" w:color="auto"/>
-      </w:divBdr>
-    </w:div>
-    <w:div w:id="1987128271">
-      <w:bodyDiv w:val="1"/>
-      <w:marLeft w:val="0"/>
-      <w:marRight w:val="0"/>
-      <w:marTop w:val="0"/>
-      <w:marBottom w:val="0"/>
-      <w:divBdr>
-        <w:top w:val="none" w:sz="0" w:space="0" w:color="auto"/>
-        <w:left w:val="none" w:sz="0" w:space="0" w:color="auto"/>
-        <w:bottom w:val="none" w:sz="0" w:space="0" w:color="auto"/>
-        <w:right w:val="none" w:sz="0" w:space="0" w:color="auto"/>
-      </w:divBdr>
-    </w:div>
-    <w:div w:id="2027711001">
-      <w:bodyDiv w:val="1"/>
-      <w:marLeft w:val="0"/>
-      <w:marRight w:val="0"/>
-      <w:marTop w:val="0"/>
-      <w:marBottom w:val="0"/>
-      <w:divBdr>
-        <w:top w:val="none" w:sz="0" w:space="0" w:color="auto"/>
-        <w:left w:val="none" w:sz="0" w:space="0" w:color="auto"/>
-        <w:bottom w:val="none" w:sz="0" w:space="0" w:color="auto"/>
-        <w:right w:val="none" w:sz="0" w:space="0" w:color="auto"/>
-      </w:divBdr>
-    </w:div>
-    <w:div w:id="2042778143">
-      <w:bodyDiv w:val="1"/>
-      <w:marLeft w:val="0"/>
-      <w:marRight w:val="0"/>
-      <w:marTop w:val="0"/>
-      <w:marBottom w:val="0"/>
-      <w:divBdr>
-        <w:top w:val="none" w:sz="0" w:space="0" w:color="auto"/>
-        <w:left w:val="none" w:sz="0" w:space="0" w:color="auto"/>
-        <w:bottom w:val="none" w:sz="0" w:space="0" w:color="auto"/>
-        <w:right w:val="none" w:sz="0" w:space="0" w:color="auto"/>
-      </w:divBdr>
-    </w:div>
-    <w:div w:id="2066875309">
-      <w:bodyDiv w:val="1"/>
-      <w:marLeft w:val="0"/>
-      <w:marRight w:val="0"/>
-      <w:marTop w:val="0"/>
-      <w:marBottom w:val="0"/>
-      <w:divBdr>
-        <w:top w:val="none" w:sz="0" w:space="0" w:color="auto"/>
-        <w:left w:val="none" w:sz="0" w:space="0" w:color="auto"/>
-        <w:bottom w:val="none" w:sz="0" w:space="0" w:color="auto"/>
-        <w:right w:val="none" w:sz="0" w:space="0" w:color="auto"/>
-      </w:divBdr>
-    </w:div>
-    <w:div w:id="2107382888">
-      <w:bodyDiv w:val="1"/>
-      <w:marLeft w:val="0"/>
-      <w:marRight w:val="0"/>
-      <w:marTop w:val="0"/>
-      <w:marBottom w:val="0"/>
-      <w:divBdr>
-        <w:top w:val="none" w:sz="0" w:space="0" w:color="auto"/>
-        <w:left w:val="none" w:sz="0" w:space="0" w:color="auto"/>
-        <w:bottom w:val="none" w:sz="0" w:space="0" w:color="auto"/>
-        <w:right w:val="none" w:sz="0" w:space="0" w:color="auto"/>
-      </w:divBdr>
-    </w:div>
-    <w:div w:id="2118140991">
-      <w:bodyDiv w:val="1"/>
-      <w:marLeft w:val="0"/>
-      <w:marRight w:val="0"/>
-      <w:marTop w:val="0"/>
-      <w:marBottom w:val="0"/>
-      <w:divBdr>
-        <w:top w:val="none" w:sz="0" w:space="0" w:color="auto"/>
-        <w:left w:val="none" w:sz="0" w:space="0" w:color="auto"/>
-        <w:bottom w:val="none" w:sz="0" w:space="0" w:color="auto"/>
-        <w:right w:val="none" w:sz="0" w:space="0" w:color="auto"/>
-      </w:divBdr>
-    </w:div>
-    <w:div w:id="2120223527">
-      <w:bodyDiv w:val="1"/>
-      <w:marLeft w:val="0"/>
-      <w:marRight w:val="0"/>
-      <w:marTop w:val="0"/>
-      <w:marBottom w:val="0"/>
-      <w:divBdr>
-        <w:top w:val="none" w:sz="0" w:space="0" w:color="auto"/>
-        <w:left w:val="none" w:sz="0" w:space="0" w:color="auto"/>
-        <w:bottom w:val="none" w:sz="0" w:space="0" w:color="auto"/>
-        <w:right w:val="none" w:sz="0" w:space="0" w:color="auto"/>
-      </w:divBdr>
-    </w:div>
-    <w:div w:id="2126851494">
-      <w:bodyDiv w:val="1"/>
-      <w:marLeft w:val="0"/>
-      <w:marRight w:val="0"/>
-      <w:marTop w:val="0"/>
-      <w:marBottom w:val="0"/>
-      <w:divBdr>
-        <w:top w:val="none" w:sz="0" w:space="0" w:color="auto"/>
-        <w:left w:val="none" w:sz="0" w:space="0" w:color="auto"/>
-        <w:bottom w:val="none" w:sz="0" w:space="0" w:color="auto"/>
-        <w:right w:val="none" w:sz="0" w:space="0" w:color="auto"/>
-      </w:divBdr>
-    </w:div>
-  </w:divs>
-  <w:optimizeForBrowser/>
-  <w:relyOnVML/>
-  <w:allowPNG/>
-</w:webSettings>
+<file path=customXml/item1.xml><?xml version="1.0" encoding="utf-8"?>
+<b:Sources xmlns:b="http://schemas.openxmlformats.org/officeDocument/2006/bibliography" xmlns="http://schemas.openxmlformats.org/officeDocument/2006/bibliography" SelectedStyle="\APA.XSL" StyleName="APA"/>
+</file>
+
+<file path=customXml/itemProps1.xml><?xml version="1.0" encoding="utf-8"?>
+<ds:datastoreItem xmlns:ds="http://schemas.openxmlformats.org/officeDocument/2006/customXml" ds:itemID="{4B5BE7AD-7AD7-4FE5-99D3-35BDF0133069}">
+  <ds:schemaRefs>
+    <ds:schemaRef ds:uri="http://schemas.openxmlformats.org/officeDocument/2006/bibliography"/>
+  </ds:schemaRefs>
+</ds:datastoreItem>
 </file>
</xml_diff>